<commit_message>
docs: manuscript visual changes
</commit_message>
<xml_diff>
--- a/manuscript/manuscript.docx
+++ b/manuscript/manuscript.docx
@@ -1202,7 +1202,13 @@
         <w:rPr>
           <w:lang w:val="en-US"/>
         </w:rPr>
-        <w:t xml:space="preserve"> — which performed 98.8% of procedures — was not among the highest-mortality municipalities in the state.</w:t>
+        <w:t xml:space="preserve"> — which performed 98.8% of procedures — was not among the highest-mortality municipalities in the state</w:t>
+      </w:r>
+      <w:r>
+        <w:rPr>
+          <w:lang w:val="en-US"/>
+        </w:rPr>
+        <w:t>.</w:t>
       </w:r>
     </w:p>
     <w:p>
@@ -1219,10 +1225,10 @@
           <w:lang w:val="en-US"/>
         </w:rPr>
         <w:drawing>
-          <wp:inline distT="0" distB="0" distL="0" distR="0" wp14:anchorId="2FD7A39E" wp14:editId="2E9ED233">
-            <wp:extent cx="5476875" cy="2305050"/>
-            <wp:effectExtent l="0" t="0" r="9525" b="0"/>
-            <wp:docPr id="3" name="Imagem 3"/>
+          <wp:inline distT="0" distB="0" distL="0" distR="0" wp14:anchorId="48170B15" wp14:editId="3AE51DFF">
+            <wp:extent cx="5476875" cy="2352675"/>
+            <wp:effectExtent l="0" t="0" r="9525" b="9525"/>
+            <wp:docPr id="2" name="Imagem 2"/>
             <wp:cNvGraphicFramePr>
               <a:graphicFrameLocks xmlns:a="http://schemas.openxmlformats.org/drawingml/2006/main" noChangeAspect="1"/>
             </wp:cNvGraphicFramePr>
@@ -1230,7 +1236,7 @@
               <a:graphicData uri="http://schemas.openxmlformats.org/drawingml/2006/picture">
                 <pic:pic xmlns:pic="http://schemas.openxmlformats.org/drawingml/2006/picture">
                   <pic:nvPicPr>
-                    <pic:cNvPr id="0" name="Picture 2"/>
+                    <pic:cNvPr id="0" name="Picture 1"/>
                     <pic:cNvPicPr>
                       <a:picLocks noChangeAspect="1" noChangeArrowheads="1"/>
                     </pic:cNvPicPr>
@@ -1251,7 +1257,7 @@
                   <pic:spPr bwMode="auto">
                     <a:xfrm>
                       <a:off x="0" y="0"/>
-                      <a:ext cx="5476875" cy="2305050"/>
+                      <a:ext cx="5476875" cy="2352675"/>
                     </a:xfrm>
                     <a:prstGeom prst="rect">
                       <a:avLst/>
@@ -1270,6 +1276,29 @@
     </w:p>
     <w:p>
       <w:pPr>
+        <w:spacing w:after="120" w:line="360" w:lineRule="auto"/>
+        <w:jc w:val="both"/>
+        <w:rPr>
+          <w:i/>
+          <w:iCs/>
+          <w:sz w:val="22"/>
+          <w:szCs w:val="22"/>
+          <w:lang w:val="en-US"/>
+        </w:rPr>
+      </w:pPr>
+      <w:r>
+        <w:rPr>
+          <w:i/>
+          <w:iCs/>
+          <w:sz w:val="22"/>
+          <w:szCs w:val="22"/>
+          <w:lang w:val="en-US"/>
+        </w:rPr>
+        <w:t>Figure 1 [procedure concentration]</w:t>
+      </w:r>
+    </w:p>
+    <w:p>
+      <w:pPr>
         <w:pStyle w:val="Ttulo2"/>
         <w:spacing w:before="200" w:after="80"/>
         <w:rPr>
@@ -1348,6 +1377,11 @@
         <w:pStyle w:val="Ttulo2"/>
         <w:spacing w:before="200" w:after="80"/>
         <w:rPr>
+          <w:lang w:val="en-US"/>
+        </w:rPr>
+      </w:pPr>
+      <w:r>
+        <w:rPr>
           <w:b/>
           <w:bCs/>
           <w:i/>
@@ -1356,26 +1390,6 @@
           <w:szCs w:val="24"/>
           <w:lang w:val="en-US"/>
         </w:rPr>
-      </w:pPr>
-    </w:p>
-    <w:p>
-      <w:pPr>
-        <w:pStyle w:val="Ttulo2"/>
-        <w:spacing w:before="200" w:after="80"/>
-        <w:rPr>
-          <w:lang w:val="en-US"/>
-        </w:rPr>
-      </w:pPr>
-      <w:r>
-        <w:rPr>
-          <w:b/>
-          <w:bCs/>
-          <w:i/>
-          <w:iCs/>
-          <w:sz w:val="24"/>
-          <w:szCs w:val="24"/>
-          <w:lang w:val="en-US"/>
-        </w:rPr>
         <w:lastRenderedPageBreak/>
         <w:t>Temporal trends</w:t>
       </w:r>
@@ -1438,7 +1452,13 @@
         <w:rPr>
           <w:lang w:val="en-US"/>
         </w:rPr>
-        <w:t>over five years. The steepest year-on-year rise occurred between 2019 and 2021, coinciding with the peak of COVID-19 in Brazil. This trajectory is consistent with documented pandemic-era disruption of elective and urgent cardiovascular care nationally, including cancellations of catheterization procedures and reduced hospital-seeking behavior among patients with acute coronary syndromes.</w:t>
+        <w:t>over five years. The steepest year-on-year rise occurred between 2019 and 2021, coinciding with the peak of COVID-19 in Brazil. This trajectory is consistent with documented pandemic-era disruption of elective and urgent cardiovascular care nationally, including cancellations of catheterization procedures and reduced hospital-seeking behavior among patients with acute coronary syndromes</w:t>
+      </w:r>
+      <w:r>
+        <w:rPr>
+          <w:lang w:val="en-US"/>
+        </w:rPr>
+        <w:t>.</w:t>
       </w:r>
     </w:p>
     <w:p>
@@ -1503,6 +1523,16 @@
           </wp:inline>
         </w:drawing>
       </w:r>
+      <w:r>
+        <w:rPr>
+          <w:i/>
+          <w:iCs/>
+          <w:sz w:val="22"/>
+          <w:szCs w:val="22"/>
+          <w:lang w:val="en-US"/>
+        </w:rPr>
+        <w:t>(Figure 2 [cardiovascular mortality trends]</w:t>
+      </w:r>
     </w:p>
     <w:p>
       <w:pPr>
@@ -1537,17 +1567,14 @@
         <w:rPr>
           <w:lang w:val="en-US"/>
         </w:rPr>
-        <w:t>K-Means clustering (k=4, silhouette score=0.305, mean internal ARI=0.886 across 30 independent runs) partitioned the 142 non-reference municipalities into four groups with distinct cardiovascular profiles (Table 1, Figure [cluster map]).</w:t>
-      </w:r>
-    </w:p>
-    <w:p>
-      <w:pPr>
-        <w:spacing w:after="120" w:line="360" w:lineRule="auto"/>
-        <w:jc w:val="both"/>
-        <w:rPr>
-          <w:lang w:val="en-US"/>
-        </w:rPr>
-      </w:pPr>
+        <w:t>K-Means clustering (k=4, silhouette score=0.305, mean internal ARI=0.886 across 30 independent runs) partitioned the 142 non-reference municipalities into four groups with distinct cardiovascular profiles</w:t>
+      </w:r>
+      <w:r>
+        <w:rPr>
+          <w:lang w:val="en-US"/>
+        </w:rPr>
+        <w:t>.</w:t>
+      </w:r>
     </w:p>
     <w:p>
       <w:pPr>
@@ -2679,6 +2706,29 @@
         <w:spacing w:after="120" w:line="360" w:lineRule="auto"/>
         <w:jc w:val="both"/>
         <w:rPr>
+          <w:i/>
+          <w:iCs/>
+          <w:sz w:val="22"/>
+          <w:szCs w:val="22"/>
+          <w:lang w:val="en-US"/>
+        </w:rPr>
+      </w:pPr>
+      <w:r>
+        <w:rPr>
+          <w:i/>
+          <w:iCs/>
+          <w:sz w:val="22"/>
+          <w:szCs w:val="22"/>
+          <w:lang w:val="en-US"/>
+        </w:rPr>
+        <w:t>Figure 3 [cluster map]</w:t>
+      </w:r>
+    </w:p>
+    <w:p>
+      <w:pPr>
+        <w:spacing w:after="120" w:line="360" w:lineRule="auto"/>
+        <w:jc w:val="both"/>
+        <w:rPr>
           <w:lang w:val="en-US"/>
         </w:rPr>
       </w:pPr>
@@ -3528,12 +3578,7 @@
     <w:p>
       <w:pPr>
         <w:pStyle w:val="Ttulo1"/>
-        <w:spacing w:before="240" w:after="120"/>
-        <w:rPr>
-          <w:lang w:val="en-US"/>
-        </w:rPr>
-      </w:pPr>
-      <w:r>
+        <w:spacing w:before="240" w:after="120" w:line="360" w:lineRule="auto"/>
         <w:rPr>
           <w:b/>
           <w:bCs/>
@@ -3542,7 +3587,82 @@
           <w:szCs w:val="28"/>
           <w:lang w:val="en-US"/>
         </w:rPr>
+      </w:pPr>
+      <w:r>
+        <w:rPr>
+          <w:b/>
+          <w:bCs/>
+          <w:caps/>
+          <w:sz w:val="28"/>
+          <w:szCs w:val="28"/>
+          <w:lang w:val="en-US"/>
+        </w:rPr>
         <w:lastRenderedPageBreak/>
+        <w:t>Supporting Information</w:t>
+      </w:r>
+      <w:r>
+        <w:rPr>
+          <w:lang w:val="en-US"/>
+        </w:rPr>
+        <w:br/>
+      </w:r>
+      <w:r>
+        <w:rPr>
+          <w:color w:val="auto"/>
+          <w:sz w:val="24"/>
+          <w:szCs w:val="24"/>
+          <w:lang w:val="en-US"/>
+        </w:rPr>
+        <w:t>S1 Figure. Elbow method and silhouette analysis for cluster number selection.</w:t>
+      </w:r>
+      <w:r>
+        <w:rPr>
+          <w:color w:val="auto"/>
+          <w:sz w:val="24"/>
+          <w:szCs w:val="24"/>
+          <w:lang w:val="en-US"/>
+        </w:rPr>
+        <w:br/>
+        <w:t>S2 Figure. Cluster profiles — mean feature values by cluster.</w:t>
+      </w:r>
+      <w:r>
+        <w:rPr>
+          <w:color w:val="auto"/>
+          <w:sz w:val="24"/>
+          <w:szCs w:val="24"/>
+          <w:lang w:val="en-US"/>
+        </w:rPr>
+        <w:br/>
+        <w:t>S3 Figure. Cardiovascular mortality rate distribution across municipalities.</w:t>
+      </w:r>
+      <w:r>
+        <w:rPr>
+          <w:color w:val="auto"/>
+          <w:sz w:val="24"/>
+          <w:szCs w:val="24"/>
+          <w:lang w:val="en-US"/>
+        </w:rPr>
+        <w:br/>
+        <w:t>S4 Figure. Economic gradient — GDP per capita versus cardiovascular mortality rate."</w:t>
+      </w:r>
+    </w:p>
+    <w:p>
+      <w:pPr>
+        <w:pStyle w:val="Ttulo1"/>
+        <w:spacing w:before="240" w:after="120"/>
+        <w:rPr>
+          <w:lang w:val="en-US"/>
+        </w:rPr>
+      </w:pPr>
+      <w:r>
+        <w:rPr>
+          <w:b/>
+          <w:bCs/>
+          <w:caps/>
+          <w:sz w:val="28"/>
+          <w:szCs w:val="28"/>
+          <w:lang w:val="en-US"/>
+        </w:rPr>
         <w:t>References</w:t>
       </w:r>
     </w:p>

</xml_diff>

<commit_message>
docs: manuscript figures legends correction
</commit_message>
<xml_diff>
--- a/manuscript/manuscript.docx
+++ b/manuscript/manuscript.docx
@@ -220,22 +220,8 @@
         <w:rPr>
           <w:lang w:val="en-US"/>
         </w:rPr>
-        <w:t xml:space="preserve">: cardiovascular mortality rate per 100,000 inhabitants, log-transformed GDP per capita, and smoothed five-year mortality growth trend. Cluster validity was assessed by silhouette score, internal stability across 30 runs (Adjusted Rand Index), and one-way </w:t>
-      </w:r>
-      <w:proofErr w:type="gramStart"/>
-      <w:r>
-        <w:rPr>
-          <w:lang w:val="en-US"/>
-        </w:rPr>
-        <w:t>ANOVA.</w:t>
-      </w:r>
-      <w:r>
-        <w:rPr>
-          <w:lang w:val="en-US"/>
-        </w:rPr>
-        <w:t>.</w:t>
-      </w:r>
-      <w:proofErr w:type="gramEnd"/>
+        <w:t>: cardiovascular mortality rate per 100,000 inhabitants, log-transformed GDP per capita, and smoothed five-year mortality growth trend. Cluster validity was assessed by silhouette score, internal stability across 30 runs (Adjusted Rand Index), and one-way ANOVA.</w:t>
+      </w:r>
     </w:p>
     <w:p>
       <w:pPr>
@@ -1288,19 +1274,36 @@
       </w:pPr>
       <w:r>
         <w:rPr>
+          <w:b/>
+          <w:bCs/>
           <w:i/>
           <w:iCs/>
           <w:sz w:val="22"/>
           <w:szCs w:val="22"/>
           <w:lang w:val="en-US"/>
         </w:rPr>
-        <w:t>Figure 1 [procedure concentration]</w:t>
+        <w:t>Fig 1. Cardiac catheterization access in Pará, Brazil (2019–2023).</w:t>
+      </w:r>
+      <w:r>
+        <w:rPr>
+          <w:i/>
+          <w:iCs/>
+          <w:sz w:val="22"/>
+          <w:szCs w:val="22"/>
+          <w:lang w:val="en-US"/>
+        </w:rPr>
+        <w:t xml:space="preserve"> Left: proportion of municipalities with and without catheterization access. Right: total SUS-funded cardiac catheterization procedures by municipality. All 5,324 procedures were concentrated in two municipalities.</w:t>
       </w:r>
     </w:p>
     <w:p>
       <w:pPr>
         <w:pStyle w:val="Ttulo2"/>
         <w:spacing w:before="200" w:after="80"/>
+        <w:rPr>
+          <w:lang w:val="en-US"/>
+        </w:rPr>
+      </w:pPr>
+      <w:r>
         <w:rPr>
           <w:b/>
           <w:bCs/>
@@ -1310,87 +1313,6 @@
           <w:szCs w:val="24"/>
           <w:lang w:val="en-US"/>
         </w:rPr>
-      </w:pPr>
-    </w:p>
-    <w:p>
-      <w:pPr>
-        <w:pStyle w:val="Ttulo2"/>
-        <w:spacing w:before="200" w:after="80"/>
-        <w:rPr>
-          <w:b/>
-          <w:bCs/>
-          <w:i/>
-          <w:iCs/>
-          <w:sz w:val="24"/>
-          <w:szCs w:val="24"/>
-          <w:lang w:val="en-US"/>
-        </w:rPr>
-      </w:pPr>
-    </w:p>
-    <w:p>
-      <w:pPr>
-        <w:pStyle w:val="Ttulo2"/>
-        <w:spacing w:before="200" w:after="80"/>
-        <w:rPr>
-          <w:b/>
-          <w:bCs/>
-          <w:i/>
-          <w:iCs/>
-          <w:sz w:val="24"/>
-          <w:szCs w:val="24"/>
-          <w:lang w:val="en-US"/>
-        </w:rPr>
-      </w:pPr>
-    </w:p>
-    <w:p>
-      <w:pPr>
-        <w:pStyle w:val="Ttulo2"/>
-        <w:spacing w:before="200" w:after="80"/>
-        <w:rPr>
-          <w:b/>
-          <w:bCs/>
-          <w:i/>
-          <w:iCs/>
-          <w:sz w:val="24"/>
-          <w:szCs w:val="24"/>
-          <w:lang w:val="en-US"/>
-        </w:rPr>
-      </w:pPr>
-    </w:p>
-    <w:p>
-      <w:pPr>
-        <w:pStyle w:val="Ttulo2"/>
-        <w:spacing w:before="200" w:after="80"/>
-        <w:rPr>
-          <w:b/>
-          <w:bCs/>
-          <w:i/>
-          <w:iCs/>
-          <w:sz w:val="24"/>
-          <w:szCs w:val="24"/>
-          <w:lang w:val="en-US"/>
-        </w:rPr>
-      </w:pPr>
-    </w:p>
-    <w:p>
-      <w:pPr>
-        <w:pStyle w:val="Ttulo2"/>
-        <w:spacing w:before="200" w:after="80"/>
-        <w:rPr>
-          <w:lang w:val="en-US"/>
-        </w:rPr>
-      </w:pPr>
-      <w:r>
-        <w:rPr>
-          <w:b/>
-          <w:bCs/>
-          <w:i/>
-          <w:iCs/>
-          <w:sz w:val="24"/>
-          <w:szCs w:val="24"/>
-          <w:lang w:val="en-US"/>
-        </w:rPr>
-        <w:lastRenderedPageBreak/>
         <w:t>Temporal trends</w:t>
       </w:r>
     </w:p>
@@ -1452,7 +1374,14 @@
         <w:rPr>
           <w:lang w:val="en-US"/>
         </w:rPr>
-        <w:t>over five years. The steepest year-on-year rise occurred between 2019 and 2021, coinciding with the peak of COVID-19 in Brazil. This trajectory is consistent with documented pandemic-era disruption of elective and urgent cardiovascular care nationally, including cancellations of catheterization procedures and reduced hospital-seeking behavior among patients with acute coronary syndromes</w:t>
+        <w:t>over five years. The steepest year-on-</w:t>
+      </w:r>
+      <w:r>
+        <w:rPr>
+          <w:lang w:val="en-US"/>
+        </w:rPr>
+        <w:lastRenderedPageBreak/>
+        <w:t>year rise occurred between 2019 and 2021, coinciding with the peak of COVID-19 in Brazil. This trajectory is consistent with documented pandemic-era disruption of elective and urgent cardiovascular care nationally, including cancellations of catheterization procedures and reduced hospital-seeking behavior among patients with acute coronary syndromes</w:t>
       </w:r>
       <w:r>
         <w:rPr>
@@ -1525,13 +1454,69 @@
       </w:r>
       <w:r>
         <w:rPr>
+          <w:b/>
+          <w:bCs/>
           <w:i/>
           <w:iCs/>
           <w:sz w:val="22"/>
           <w:szCs w:val="22"/>
           <w:lang w:val="en-US"/>
         </w:rPr>
-        <w:t>(Figure 2 [cardiovascular mortality trends]</w:t>
+        <w:t xml:space="preserve">Fig 2. Cardiovascular mortality trends in Pará, Brazil (2019–2023). </w:t>
+      </w:r>
+      <w:r>
+        <w:rPr>
+          <w:i/>
+          <w:iCs/>
+          <w:sz w:val="22"/>
+          <w:szCs w:val="22"/>
+          <w:lang w:val="en-US"/>
+        </w:rPr>
+        <w:t xml:space="preserve">Left: state-level annual cardiovascular deaths. Right: distribution of per-municipality mortality rates by year. Shaded area indicates the COVID-19 </w:t>
+      </w:r>
+      <w:proofErr w:type="spellStart"/>
+      <w:r>
+        <w:rPr>
+          <w:i/>
+          <w:iCs/>
+          <w:sz w:val="22"/>
+          <w:szCs w:val="22"/>
+          <w:lang w:val="en-US"/>
+        </w:rPr>
+        <w:t>disruption</w:t>
+      </w:r>
+      <w:proofErr w:type="spellEnd"/>
+      <w:r>
+        <w:rPr>
+          <w:i/>
+          <w:iCs/>
+          <w:sz w:val="22"/>
+          <w:szCs w:val="22"/>
+          <w:lang w:val="en-US"/>
+        </w:rPr>
+        <w:t xml:space="preserve"> </w:t>
+      </w:r>
+      <w:proofErr w:type="spellStart"/>
+      <w:r>
+        <w:rPr>
+          <w:i/>
+          <w:iCs/>
+          <w:sz w:val="22"/>
+          <w:szCs w:val="22"/>
+          <w:lang w:val="en-US"/>
+        </w:rPr>
+        <w:t>period</w:t>
+      </w:r>
+      <w:proofErr w:type="spellEnd"/>
+      <w:r>
+        <w:rPr>
+          <w:i/>
+          <w:iCs/>
+          <w:sz w:val="22"/>
+          <w:szCs w:val="22"/>
+          <w:lang w:val="en-US"/>
+        </w:rPr>
+        <w:t xml:space="preserve"> (2020–2022).</w:t>
       </w:r>
     </w:p>
     <w:p>
@@ -2272,7 +2257,7 @@
                 <w:sz w:val="22"/>
                 <w:szCs w:val="22"/>
               </w:rPr>
-              <w:t>0.0015</w:t>
+              <w:t>&lt;0.001</w:t>
             </w:r>
           </w:p>
         </w:tc>
@@ -2715,13 +2700,68 @@
       </w:pPr>
       <w:r>
         <w:rPr>
+          <w:rStyle w:val="Forte"/>
           <w:i/>
           <w:iCs/>
           <w:sz w:val="22"/>
           <w:szCs w:val="22"/>
           <w:lang w:val="en-US"/>
         </w:rPr>
-        <w:t>Figure 3 [cluster map]</w:t>
+        <w:t>Fig 3. Cardiovascular care clusters in Pará, Brazil (2019–2023).</w:t>
+      </w:r>
+      <w:r>
+        <w:rPr>
+          <w:i/>
+          <w:iCs/>
+          <w:sz w:val="22"/>
+          <w:szCs w:val="22"/>
+          <w:lang w:val="en-US"/>
+        </w:rPr>
+        <w:t xml:space="preserve"> Left: K-Means cluster assignments (k=4) across 144 municipalities. Reference centers (</w:t>
+      </w:r>
+      <w:proofErr w:type="spellStart"/>
+      <w:r>
+        <w:rPr>
+          <w:i/>
+          <w:iCs/>
+          <w:sz w:val="22"/>
+          <w:szCs w:val="22"/>
+          <w:lang w:val="en-US"/>
+        </w:rPr>
+        <w:t>Belém</w:t>
+      </w:r>
+      <w:proofErr w:type="spellEnd"/>
+      <w:r>
+        <w:rPr>
+          <w:i/>
+          <w:iCs/>
+          <w:sz w:val="22"/>
+          <w:szCs w:val="22"/>
+          <w:lang w:val="en-US"/>
+        </w:rPr>
+        <w:t xml:space="preserve"> and </w:t>
+      </w:r>
+      <w:proofErr w:type="spellStart"/>
+      <w:r>
+        <w:rPr>
+          <w:i/>
+          <w:iCs/>
+          <w:sz w:val="22"/>
+          <w:szCs w:val="22"/>
+          <w:lang w:val="en-US"/>
+        </w:rPr>
+        <w:t>Ananindeua</w:t>
+      </w:r>
+      <w:proofErr w:type="spellEnd"/>
+      <w:r>
+        <w:rPr>
+          <w:i/>
+          <w:iCs/>
+          <w:sz w:val="22"/>
+          <w:szCs w:val="22"/>
+          <w:lang w:val="en-US"/>
+        </w:rPr>
+        <w:t>) shown in navy. Right: cardiovascular mortality rate choropleth (darker red = higher mortality).</w:t>
       </w:r>
     </w:p>
     <w:p>
@@ -2833,7 +2873,14 @@
         <w:rPr>
           <w:lang w:val="en-US"/>
         </w:rPr>
-        <w:t xml:space="preserve">% over the study period despite mortality rates initially below the state mean (159.5 per 100,000). This trajectory indicates municipalities that were not the worst performers at the start of the period but experienced structural collapse in cardiovascular outcomes during it, likely amplified by COVID-19 disruption in health systems with limited pre-existing resilience. </w:t>
+        <w:t xml:space="preserve">% over the study period despite mortality rates initially below the state mean (159.5 per 100,000). This trajectory indicates municipalities that were not the worst performers at the start of the period but experienced structural collapse in cardiovascular outcomes during it, likely amplified by COVID-19 </w:t>
+      </w:r>
+      <w:r>
+        <w:rPr>
+          <w:lang w:val="en-US"/>
+        </w:rPr>
+        <w:lastRenderedPageBreak/>
+        <w:t xml:space="preserve">disruption in health systems with limited pre-existing resilience. </w:t>
       </w:r>
       <w:proofErr w:type="spellStart"/>
       <w:r>
@@ -2889,14 +2936,7 @@
         <w:rPr>
           <w:lang w:val="en-US"/>
         </w:rPr>
-        <w:t xml:space="preserve"> are among the most extreme cases. The small cluster </w:t>
-      </w:r>
-      <w:r>
-        <w:rPr>
-          <w:lang w:val="en-US"/>
-        </w:rPr>
-        <w:lastRenderedPageBreak/>
-        <w:t>size (n=18) warrants caution in generalization, but the trajectory is statistically robust (F=</w:t>
+        <w:t xml:space="preserve"> are among the most extreme cases. The small cluster size (n=18) warrants caution in generalization, but the trajectory is statistically robust (F=</w:t>
       </w:r>
       <w:r>
         <w:rPr>
@@ -3182,14 +3222,14 @@
         <w:rPr>
           <w:lang w:val="en-US"/>
         </w:rPr>
-        <w:t xml:space="preserve">This analysis makes three contributions. First, it quantifies the extreme concentration of cardiac catheterization capacity in Pará: two municipalities performed every recorded SUS catheterization between 2019 and 2023, while 142 municipalities recorded none. This is not a statistical artifact — it reflects the physical absence of catheterization laboratories, </w:t>
+        <w:t xml:space="preserve">This analysis makes three contributions. First, it quantifies the extreme concentration of cardiac catheterization capacity in Pará: two municipalities performed every recorded SUS </w:t>
       </w:r>
       <w:r>
         <w:rPr>
           <w:lang w:val="en-US"/>
         </w:rPr>
         <w:lastRenderedPageBreak/>
-        <w:t>trained interventional cardiologists, and the supply chains required to sustain them across most of the state's territory.</w:t>
+        <w:t>catheterization between 2019 and 2023, while 142 municipalities recorded none. This is not a statistical artifact — it reflects the physical absence of catheterization laboratories, trained interventional cardiologists, and the supply chains required to sustain them across most of the state's territory.</w:t>
       </w:r>
     </w:p>
     <w:p>
@@ -3280,7 +3320,14 @@
         <w:rPr>
           <w:lang w:val="en-US"/>
         </w:rPr>
-        <w:t>%) may partly reflect these dynamics concentrated in municipalities that entered the pandemic with the least resilient health systems. Disentangling pandemic effects from pre-existing structural trends is beyond the scope of this analysis but represents an important next step.</w:t>
+        <w:t xml:space="preserve">%) may partly reflect these dynamics concentrated in municipalities that entered the pandemic </w:t>
+      </w:r>
+      <w:r>
+        <w:rPr>
+          <w:lang w:val="en-US"/>
+        </w:rPr>
+        <w:lastRenderedPageBreak/>
+        <w:t>with the least resilient health systems. Disentangling pandemic effects from pre-existing structural trends is beyond the scope of this analysis but represents an important next step.</w:t>
       </w:r>
     </w:p>
     <w:p>
@@ -3318,7 +3365,6 @@
           <w:szCs w:val="24"/>
           <w:lang w:val="en-US"/>
         </w:rPr>
-        <w:lastRenderedPageBreak/>
         <w:t>The Critical Mortality Burden cluster as an unexplained residual</w:t>
       </w:r>
     </w:p>
@@ -3412,29 +3458,29 @@
         <w:rPr>
           <w:lang w:val="en-US"/>
         </w:rPr>
-        <w:t xml:space="preserve"> indicates moderate but not strong cluster separation. This is expected in health geography applications where municipalities exist on a continuum rather than in discrete health categories; it does not invalidate the clustering but indicates that cluster boundaries are gradients rather than sharp divisions. Fifth, this analysis is limited to one state. Generalizability to other Brazilian states or to other large countries with similar geographic structures requires replication.</w:t>
-      </w:r>
-    </w:p>
-    <w:p>
-      <w:pPr>
-        <w:spacing w:after="120" w:line="360" w:lineRule="auto"/>
-        <w:jc w:val="both"/>
-        <w:rPr>
-          <w:lang w:val="en-US"/>
-        </w:rPr>
-      </w:pPr>
-      <w:r>
-        <w:rPr>
-          <w:lang w:val="en-US"/>
-        </w:rPr>
-        <w:t xml:space="preserve">The mortality growth metric, despite two-year block averaging and Laplace smoothing, remains sensitive to the small-numbers effect in the lowest-population municipalities. </w:t>
+        <w:t xml:space="preserve"> indicates moderate but not strong cluster separation. This is expected in health geography applications where municipalities exist on a continuum rather than in discrete health categories; it does not invalidate the clustering but indicates that cluster boundaries are gradients rather than sharp divisions. Fifth, this </w:t>
       </w:r>
       <w:r>
         <w:rPr>
           <w:lang w:val="en-US"/>
         </w:rPr>
         <w:lastRenderedPageBreak/>
-        <w:t>Future iterations should incorporate empirical Bayes smoothing or spatial empirical priors to provide more stable epidemiological trajectories in low-density regions, particularly within the Rapidly Deteriorating cluster.</w:t>
+        <w:t>analysis is limited to one state. Generalizability to other Brazilian states or to other large countries with similar geographic structures requires replication.</w:t>
+      </w:r>
+    </w:p>
+    <w:p>
+      <w:pPr>
+        <w:spacing w:after="120" w:line="360" w:lineRule="auto"/>
+        <w:jc w:val="both"/>
+        <w:rPr>
+          <w:lang w:val="en-US"/>
+        </w:rPr>
+      </w:pPr>
+      <w:r>
+        <w:rPr>
+          <w:lang w:val="en-US"/>
+        </w:rPr>
+        <w:t>The mortality growth metric, despite two-year block averaging and Laplace smoothing, remains sensitive to the small-numbers effect in the lowest-population municipalities. Future iterations should incorporate empirical Bayes smoothing or spatial empirical priors to provide more stable epidemiological trajectories in low-density regions, particularly within the Rapidly Deteriorating cluster.</w:t>
       </w:r>
     </w:p>
     <w:p>
@@ -3551,7 +3597,14 @@
         <w:rPr>
           <w:lang w:val="en-US"/>
         </w:rPr>
-        <w:t>These profiles call for differentiated policy responses rather than uniform infrastructure investment. The analysis is fully reproducible from publicly available DATASUS and IBGE data; the code is available at github.com/g4bfernandoo/regional-health-disparities-</w:t>
+        <w:t xml:space="preserve">These profiles call for differentiated policy responses rather than uniform infrastructure investment. The analysis </w:t>
+      </w:r>
+      <w:r>
+        <w:rPr>
+          <w:lang w:val="en-US"/>
+        </w:rPr>
+        <w:lastRenderedPageBreak/>
+        <w:t>is fully reproducible from publicly available DATASUS and IBGE data; the code is available at github.com/g4bfernandoo/regional-health-disparities-</w:t>
       </w:r>
       <w:proofErr w:type="spellStart"/>
       <w:r>
@@ -3597,7 +3650,6 @@
           <w:szCs w:val="28"/>
           <w:lang w:val="en-US"/>
         </w:rPr>
-        <w:lastRenderedPageBreak/>
         <w:t>Supporting Information</w:t>
       </w:r>
       <w:r>
@@ -3882,6 +3934,7 @@
         <w:rPr>
           <w:lang w:val="en-US"/>
         </w:rPr>
+        <w:lastRenderedPageBreak/>
         <w:t>[</w:t>
       </w:r>
       <w:r>

</xml_diff>

<commit_message>
feat: manuscript minor changes and data/raw_readme.md added
</commit_message>
<xml_diff>
--- a/manuscript/manuscript.docx
+++ b/manuscript/manuscript.docx
@@ -711,6 +711,21 @@
     </w:p>
     <w:p>
       <w:pPr>
+        <w:spacing w:after="120" w:line="360" w:lineRule="auto"/>
+        <w:jc w:val="both"/>
+        <w:rPr>
+          <w:lang w:val="en-US"/>
+        </w:rPr>
+      </w:pPr>
+      <w:r>
+        <w:rPr>
+          <w:lang w:val="en-US"/>
+        </w:rPr>
+        <w:t>Data were accessed from publicly available DATASUS and IBGE repositories in June–July 2025. At no point did the authors have access to information that could identify individual participants; all data were obtained as aggregate municipality-level statistics.</w:t>
+      </w:r>
+    </w:p>
+    <w:p>
+      <w:pPr>
         <w:pStyle w:val="Ttulo2"/>
         <w:spacing w:before="200" w:after="80"/>
         <w:rPr>
@@ -864,7 +879,14 @@
         <w:rPr>
           <w:lang w:val="en-US"/>
         </w:rPr>
-        <w:t xml:space="preserve">We initially constructed four features for clustering analysis. However, because catheterization procedures were entirely absent across all 142 non-reference municipalities, the procedure rate variable (taxa_proc_100k) exhibited zero variance within this analytical subset. A zero-variance feature produces a null vector after </w:t>
+        <w:t xml:space="preserve">We initially constructed four features for clustering analysis. However, because catheterization procedures were entirely absent across all 142 non-reference municipalities, the procedure rate variable (taxa_proc_100k) exhibited zero variance within this analytical </w:t>
+      </w:r>
+      <w:r>
+        <w:rPr>
+          <w:lang w:val="en-US"/>
+        </w:rPr>
+        <w:lastRenderedPageBreak/>
+        <w:t xml:space="preserve">subset. A zero-variance feature produces a null vector after </w:t>
       </w:r>
       <w:proofErr w:type="spellStart"/>
       <w:r>
@@ -878,14 +900,7 @@
         <w:rPr>
           <w:lang w:val="en-US"/>
         </w:rPr>
-        <w:t xml:space="preserve"> normalization, contributing no information to K-Means Euclidean distance calculations while introducing a logical inconsistency between the Methods and Results sections. The variable was </w:t>
-      </w:r>
-      <w:r>
-        <w:rPr>
-          <w:lang w:val="en-US"/>
-        </w:rPr>
-        <w:lastRenderedPageBreak/>
-        <w:t>therefore excluded from the clustering model and is described separately in the Results as a descriptive characteristic of the study population. Three features were used in the final model: cardiovascular mortality rate, log-transformed GDP per capita, and a smoothed five-year mortality growth trend.</w:t>
+        <w:t xml:space="preserve"> normalization, contributing no information to K-Means Euclidean distance calculations while introducing a logical inconsistency between the Methods and Results sections. The variable was therefore excluded from the clustering model and is described separately in the Results as a descriptive characteristic of the study population. Three features were used in the final model: cardiovascular mortality rate, log-transformed GDP per capita, and a smoothed five-year mortality growth trend.</w:t>
       </w:r>
     </w:p>
     <w:p>
@@ -1031,24 +1046,6 @@
         </w:rPr>
         <w:t xml:space="preserve"> index (57.7; higher values indicate denser, more separated clusters).</w:t>
       </w:r>
-    </w:p>
-    <w:p>
-      <w:pPr>
-        <w:spacing w:after="120" w:line="360" w:lineRule="auto"/>
-        <w:jc w:val="both"/>
-        <w:rPr>
-          <w:lang w:val="en-US"/>
-        </w:rPr>
-      </w:pPr>
-    </w:p>
-    <w:p>
-      <w:pPr>
-        <w:spacing w:after="120" w:line="360" w:lineRule="auto"/>
-        <w:jc w:val="both"/>
-        <w:rPr>
-          <w:lang w:val="en-US"/>
-        </w:rPr>
-      </w:pPr>
     </w:p>
     <w:p>
       <w:pPr>
@@ -1472,51 +1469,7 @@
           <w:szCs w:val="22"/>
           <w:lang w:val="en-US"/>
         </w:rPr>
-        <w:t xml:space="preserve">Left: state-level annual cardiovascular deaths. Right: distribution of per-municipality mortality rates by year. Shaded area indicates the COVID-19 </w:t>
-      </w:r>
-      <w:proofErr w:type="spellStart"/>
-      <w:r>
-        <w:rPr>
-          <w:i/>
-          <w:iCs/>
-          <w:sz w:val="22"/>
-          <w:szCs w:val="22"/>
-          <w:lang w:val="en-US"/>
-        </w:rPr>
-        <w:t>disruption</w:t>
-      </w:r>
-      <w:proofErr w:type="spellEnd"/>
-      <w:r>
-        <w:rPr>
-          <w:i/>
-          <w:iCs/>
-          <w:sz w:val="22"/>
-          <w:szCs w:val="22"/>
-          <w:lang w:val="en-US"/>
-        </w:rPr>
-        <w:t xml:space="preserve"> </w:t>
-      </w:r>
-      <w:proofErr w:type="spellStart"/>
-      <w:r>
-        <w:rPr>
-          <w:i/>
-          <w:iCs/>
-          <w:sz w:val="22"/>
-          <w:szCs w:val="22"/>
-          <w:lang w:val="en-US"/>
-        </w:rPr>
-        <w:t>period</w:t>
-      </w:r>
-      <w:proofErr w:type="spellEnd"/>
-      <w:r>
-        <w:rPr>
-          <w:i/>
-          <w:iCs/>
-          <w:sz w:val="22"/>
-          <w:szCs w:val="22"/>
-          <w:lang w:val="en-US"/>
-        </w:rPr>
-        <w:t xml:space="preserve"> (2020–2022).</w:t>
+        <w:t>Left: state-level annual cardiovascular deaths. Right: distribution of per-municipality mortality rates by year. Shaded area indicates the COVID-19 disruption period (2020–2022).</w:t>
       </w:r>
     </w:p>
     <w:p>
@@ -2292,7 +2245,6 @@
               <w:t xml:space="preserve"> </w:t>
             </w:r>
             <w:proofErr w:type="spellStart"/>
-            <w:proofErr w:type="gramStart"/>
             <w:r>
               <w:rPr>
                 <w:sz w:val="22"/>
@@ -2320,15 +2272,7 @@
                 <w:sz w:val="22"/>
                 <w:szCs w:val="22"/>
               </w:rPr>
-              <w:t>(</w:t>
-            </w:r>
-            <w:proofErr w:type="gramEnd"/>
-            <w:r>
-              <w:rPr>
-                <w:sz w:val="22"/>
-                <w:szCs w:val="22"/>
-              </w:rPr>
-              <w:t>%)</w:t>
+              <w:t>(%)</w:t>
             </w:r>
           </w:p>
         </w:tc>
@@ -3337,21 +3281,6 @@
         <w:rPr>
           <w:b/>
           <w:bCs/>
-          <w:i/>
-          <w:iCs/>
-          <w:sz w:val="24"/>
-          <w:szCs w:val="24"/>
-          <w:lang w:val="en-US"/>
-        </w:rPr>
-      </w:pPr>
-    </w:p>
-    <w:p>
-      <w:pPr>
-        <w:pStyle w:val="Ttulo2"/>
-        <w:spacing w:before="200" w:after="80"/>
-        <w:rPr>
-          <w:b/>
-          <w:bCs/>
           <w:lang w:val="en-US"/>
         </w:rPr>
       </w:pPr>
@@ -3431,7 +3360,22 @@
         <w:rPr>
           <w:lang w:val="en-US"/>
         </w:rPr>
-        <w:t>Second, population data are from 2021 IBGE estimates; exact values for 2022 and 2023 were unavailable, introducing modest denominator imprecision for later years of the study. Third, the SIH-SUS procedure data reflect only SUS-funded catheterizations. Private-sector procedures are not captured. In municipalities with more developed private healthcare — primarily the economic corridor cluster — some residents may have accessed private cardiac care not reflected in these data, which would lead us to overestimate the true access gap in those municipalities specifically.</w:t>
+        <w:t xml:space="preserve">Second, population data are from 2021 IBGE estimates; exact values for 2022 and 2023 were unavailable, introducing modest denominator imprecision for later years of the study. </w:t>
+      </w:r>
+    </w:p>
+    <w:p>
+      <w:pPr>
+        <w:spacing w:after="120" w:line="360" w:lineRule="auto"/>
+        <w:jc w:val="both"/>
+        <w:rPr>
+          <w:lang w:val="en-US"/>
+        </w:rPr>
+      </w:pPr>
+      <w:r>
+        <w:rPr>
+          <w:lang w:val="en-US"/>
+        </w:rPr>
+        <w:t>Third, the SIH-SUS procedure data reflect only SUS-funded catheterizations. Private-sector procedures are not captured. In municipalities with more developed private healthcare — primarily the economic corridor cluster — some residents may have accessed private cardiac care not reflected in these data, which would lead us to overestimate the true access gap in those municipalities specifically.</w:t>
       </w:r>
     </w:p>
     <w:p>
@@ -3458,28 +3402,22 @@
         <w:rPr>
           <w:lang w:val="en-US"/>
         </w:rPr>
-        <w:t xml:space="preserve"> indicates moderate but not strong cluster separation. This is expected in health geography applications where municipalities exist on a continuum rather than in discrete health categories; it does not invalidate the clustering but indicates that cluster boundaries are gradients rather than sharp divisions. Fifth, this </w:t>
-      </w:r>
+        <w:t xml:space="preserve"> indicates moderate but not strong cluster separation. This is expected in health geography applications where municipalities exist on a continuum rather than in discrete health categories; it does not invalidate the clustering but indicates that cluster boundaries are gradients rather than sharp divisions. Fifth, this analysis is limited to one state. Generalizability to other Brazilian states or to other large countries with similar geographic structures requires replication.</w:t>
+      </w:r>
+    </w:p>
+    <w:p>
+      <w:pPr>
+        <w:spacing w:after="120" w:line="360" w:lineRule="auto"/>
+        <w:jc w:val="both"/>
+        <w:rPr>
+          <w:lang w:val="en-US"/>
+        </w:rPr>
+      </w:pPr>
       <w:r>
         <w:rPr>
           <w:lang w:val="en-US"/>
         </w:rPr>
         <w:lastRenderedPageBreak/>
-        <w:t>analysis is limited to one state. Generalizability to other Brazilian states or to other large countries with similar geographic structures requires replication.</w:t>
-      </w:r>
-    </w:p>
-    <w:p>
-      <w:pPr>
-        <w:spacing w:after="120" w:line="360" w:lineRule="auto"/>
-        <w:jc w:val="both"/>
-        <w:rPr>
-          <w:lang w:val="en-US"/>
-        </w:rPr>
-      </w:pPr>
-      <w:r>
-        <w:rPr>
-          <w:lang w:val="en-US"/>
-        </w:rPr>
         <w:t>The mortality growth metric, despite two-year block averaging and Laplace smoothing, remains sensitive to the small-numbers effect in the lowest-population municipalities. Future iterations should incorporate empirical Bayes smoothing or spatial empirical priors to provide more stable epidemiological trajectories in low-density regions, particularly within the Rapidly Deteriorating cluster.</w:t>
       </w:r>
     </w:p>
@@ -3597,14 +3535,7 @@
         <w:rPr>
           <w:lang w:val="en-US"/>
         </w:rPr>
-        <w:t xml:space="preserve">These profiles call for differentiated policy responses rather than uniform infrastructure investment. The analysis </w:t>
-      </w:r>
-      <w:r>
-        <w:rPr>
-          <w:lang w:val="en-US"/>
-        </w:rPr>
-        <w:lastRenderedPageBreak/>
-        <w:t>is fully reproducible from publicly available DATASUS and IBGE data; the code is available at github.com/g4bfernandoo/regional-health-disparities-</w:t>
+        <w:t>These profiles call for differentiated policy responses rather than uniform infrastructure investment. The analysis is fully reproducible from publicly available DATASUS and IBGE data; the code is available at github.com/g4bfernandoo/regional-health-disparities-</w:t>
       </w:r>
       <w:proofErr w:type="spellStart"/>
       <w:r>
@@ -3620,13 +3551,6 @@
         </w:rPr>
         <w:t>.</w:t>
       </w:r>
-    </w:p>
-    <w:p>
-      <w:pPr>
-        <w:rPr>
-          <w:lang w:val="en-US"/>
-        </w:rPr>
-      </w:pPr>
     </w:p>
     <w:p>
       <w:pPr>
@@ -3650,62 +3574,9 @@
           <w:szCs w:val="28"/>
           <w:lang w:val="en-US"/>
         </w:rPr>
-        <w:t>Supporting Information</w:t>
-      </w:r>
-      <w:r>
-        <w:rPr>
-          <w:lang w:val="en-US"/>
-        </w:rPr>
-        <w:br/>
-      </w:r>
-      <w:r>
-        <w:rPr>
-          <w:color w:val="auto"/>
-          <w:sz w:val="24"/>
-          <w:szCs w:val="24"/>
-          <w:lang w:val="en-US"/>
-        </w:rPr>
-        <w:t>S1 Figure. Elbow method and silhouette analysis for cluster number selection.</w:t>
-      </w:r>
-      <w:r>
-        <w:rPr>
-          <w:color w:val="auto"/>
-          <w:sz w:val="24"/>
-          <w:szCs w:val="24"/>
-          <w:lang w:val="en-US"/>
-        </w:rPr>
-        <w:br/>
-        <w:t>S2 Figure. Cluster profiles — mean feature values by cluster.</w:t>
-      </w:r>
-      <w:r>
-        <w:rPr>
-          <w:color w:val="auto"/>
-          <w:sz w:val="24"/>
-          <w:szCs w:val="24"/>
-          <w:lang w:val="en-US"/>
-        </w:rPr>
-        <w:br/>
-        <w:t>S3 Figure. Cardiovascular mortality rate distribution across municipalities.</w:t>
-      </w:r>
-      <w:r>
-        <w:rPr>
-          <w:color w:val="auto"/>
-          <w:sz w:val="24"/>
-          <w:szCs w:val="24"/>
-          <w:lang w:val="en-US"/>
-        </w:rPr>
-        <w:br/>
-        <w:t>S4 Figure. Economic gradient — GDP per capita versus cardiovascular mortality rate."</w:t>
-      </w:r>
-    </w:p>
-    <w:p>
-      <w:pPr>
-        <w:pStyle w:val="Ttulo1"/>
-        <w:spacing w:before="240" w:after="120"/>
-        <w:rPr>
-          <w:lang w:val="en-US"/>
-        </w:rPr>
-      </w:pPr>
+        <w:lastRenderedPageBreak/>
+        <w:t>Supporting</w:t>
+      </w:r>
       <w:r>
         <w:rPr>
           <w:b/>
@@ -3715,6 +3586,127 @@
           <w:szCs w:val="28"/>
           <w:lang w:val="en-US"/>
         </w:rPr>
+        <w:t xml:space="preserve"> Information</w:t>
+      </w:r>
+    </w:p>
+    <w:p>
+      <w:pPr>
+        <w:spacing w:after="120" w:line="360" w:lineRule="auto"/>
+        <w:jc w:val="both"/>
+        <w:rPr>
+          <w:lang w:val="en-US"/>
+        </w:rPr>
+      </w:pPr>
+      <w:r>
+        <w:rPr>
+          <w:lang w:val="en-US"/>
+        </w:rPr>
+        <w:t>S1 Figure. Elbow method and silhouette analysis for cluster number selection.</w:t>
+      </w:r>
+    </w:p>
+    <w:p>
+      <w:pPr>
+        <w:spacing w:after="120" w:line="360" w:lineRule="auto"/>
+        <w:jc w:val="both"/>
+        <w:rPr>
+          <w:lang w:val="en-US"/>
+        </w:rPr>
+      </w:pPr>
+      <w:r>
+        <w:rPr>
+          <w:lang w:val="en-US"/>
+        </w:rPr>
+        <w:t>S2</w:t>
+      </w:r>
+      <w:r>
+        <w:rPr>
+          <w:lang w:val="en-US"/>
+        </w:rPr>
+        <w:t xml:space="preserve"> Figure</w:t>
+      </w:r>
+      <w:r>
+        <w:rPr>
+          <w:lang w:val="en-US"/>
+        </w:rPr>
+        <w:t xml:space="preserve">. Cluster profiles </w:t>
+      </w:r>
+      <w:r>
+        <w:rPr>
+          <w:lang w:val="en-US"/>
+        </w:rPr>
+        <w:t xml:space="preserve">— </w:t>
+      </w:r>
+      <w:r>
+        <w:rPr>
+          <w:lang w:val="en-US"/>
+        </w:rPr>
+        <w:t>mean feature values by cluster.</w:t>
+      </w:r>
+    </w:p>
+    <w:p>
+      <w:pPr>
+        <w:spacing w:after="120" w:line="360" w:lineRule="auto"/>
+        <w:jc w:val="both"/>
+        <w:rPr>
+          <w:lang w:val="en-US"/>
+        </w:rPr>
+      </w:pPr>
+      <w:r>
+        <w:rPr>
+          <w:lang w:val="en-US"/>
+        </w:rPr>
+        <w:t>S3 Figure. Cardiovascular mortality rate distribution across municipalities.</w:t>
+      </w:r>
+    </w:p>
+    <w:p>
+      <w:pPr>
+        <w:spacing w:after="120" w:line="360" w:lineRule="auto"/>
+        <w:jc w:val="both"/>
+        <w:rPr>
+          <w:b/>
+          <w:bCs/>
+          <w:caps/>
+          <w:sz w:val="28"/>
+          <w:szCs w:val="28"/>
+          <w:lang w:val="en-US"/>
+        </w:rPr>
+      </w:pPr>
+      <w:r>
+        <w:rPr>
+          <w:lang w:val="en-US"/>
+        </w:rPr>
+        <w:t xml:space="preserve">S4 Figure. Economic gradient </w:t>
+      </w:r>
+      <w:r>
+        <w:rPr>
+          <w:lang w:val="en-US"/>
+        </w:rPr>
+        <w:t xml:space="preserve">— </w:t>
+      </w:r>
+      <w:r>
+        <w:rPr>
+          <w:lang w:val="en-US"/>
+        </w:rPr>
+        <w:t xml:space="preserve">GDP per capita versus cardiovascular mortality rate.  </w:t>
+      </w:r>
+    </w:p>
+    <w:p>
+      <w:pPr>
+        <w:pStyle w:val="Ttulo1"/>
+        <w:spacing w:before="240" w:after="120"/>
+        <w:rPr>
+          <w:lang w:val="en-US"/>
+        </w:rPr>
+      </w:pPr>
+      <w:r>
+        <w:rPr>
+          <w:b/>
+          <w:bCs/>
+          <w:caps/>
+          <w:sz w:val="28"/>
+          <w:szCs w:val="28"/>
+          <w:lang w:val="en-US"/>
+        </w:rPr>
         <w:t>References</w:t>
       </w:r>
     </w:p>
@@ -3730,7 +3722,20 @@
         <w:rPr>
           <w:lang w:val="en-US"/>
         </w:rPr>
-        <w:t>[1] GBD 2021 Causes of Death Collaborators. Global burden of 369 diseases and injuries in 204 countries and territories, 1990–2021: a systematic analysis for the Global Burden of Disease Study 2021. Lancet. 2022;400(10356):1135–1191.</w:t>
+        <w:t xml:space="preserve">[1] GBD 2021 Causes of Death Collaborators. </w:t>
+      </w:r>
+      <w:r>
+        <w:rPr>
+          <w:u w:val="single"/>
+          <w:lang w:val="en-US"/>
+        </w:rPr>
+        <w:t>Global</w:t>
+      </w:r>
+      <w:r>
+        <w:rPr>
+          <w:lang w:val="en-US"/>
+        </w:rPr>
+        <w:t xml:space="preserve"> burden of 369 diseases and injuries in 204 countries and territories, 1990–2021: a systematic analysis for the Global Burden of Disease Study 2021. Lancet. 2022;400(10356):1135–1191.</w:t>
       </w:r>
     </w:p>
     <w:p>
@@ -3934,7 +3939,6 @@
         <w:rPr>
           <w:lang w:val="en-US"/>
         </w:rPr>
-        <w:lastRenderedPageBreak/>
         <w:t>[</w:t>
       </w:r>
       <w:r>
@@ -3961,15 +3965,6 @@
         </w:rPr>
         <w:t>BMC Health Services Research. 2017;17(1):362.</w:t>
       </w:r>
-    </w:p>
-    <w:p>
-      <w:pPr>
-        <w:spacing w:after="120" w:line="360" w:lineRule="auto"/>
-        <w:jc w:val="both"/>
-        <w:rPr>
-          <w:lang w:val="en-US"/>
-        </w:rPr>
-      </w:pPr>
     </w:p>
     <w:sectPr>
       <w:pgSz w:w="12240" w:h="15840"/>
@@ -4472,6 +4467,7 @@
   <w:style w:type="paragraph" w:default="1" w:styleId="Normal">
     <w:name w:val="Normal"/>
     <w:qFormat/>
+    <w:rsid w:val="006E26D5"/>
   </w:style>
   <w:style w:type="paragraph" w:styleId="Ttulo1">
     <w:name w:val="heading 1"/>
@@ -4696,6 +4692,14 @@
     <w:name w:val="_animating_6ta1u_10"/>
     <w:basedOn w:val="Fontepargpadro"/>
     <w:rsid w:val="00456E40"/>
+  </w:style>
+  <w:style w:type="character" w:styleId="Nmerodelinha">
+    <w:name w:val="line number"/>
+    <w:basedOn w:val="Fontepargpadro"/>
+    <w:uiPriority w:val="99"/>
+    <w:semiHidden/>
+    <w:unhideWhenUsed/>
+    <w:rsid w:val="00AA5F41"/>
   </w:style>
 </w:styles>
 </file>

</xml_diff>

<commit_message>
docs: DOI added to README.md + visual corrections in the manuscript
</commit_message>
<xml_diff>
--- a/manuscript/manuscript.docx
+++ b/manuscript/manuscript.docx
@@ -69,41 +69,36 @@
       <w:pPr>
         <w:spacing w:after="40"/>
         <w:jc w:val="center"/>
-      </w:pPr>
-      <w:r>
-        <w:t xml:space="preserve">¹ Independent </w:t>
-      </w:r>
-      <w:proofErr w:type="spellStart"/>
-      <w:r>
-        <w:t>Researcher</w:t>
-      </w:r>
-      <w:proofErr w:type="spellEnd"/>
-      <w:r>
-        <w:t xml:space="preserve">, Parauapebas, Pará, </w:t>
-      </w:r>
-      <w:proofErr w:type="spellStart"/>
-      <w:r>
-        <w:t>Brazil</w:t>
-      </w:r>
-      <w:proofErr w:type="spellEnd"/>
+        <w:rPr>
+          <w:lang w:val="en-US"/>
+        </w:rPr>
+      </w:pPr>
+      <w:r>
+        <w:rPr>
+          <w:lang w:val="en-US"/>
+        </w:rPr>
+        <w:t>¹ Independent Researcher, Parauapebas, Pará, Brazil</w:t>
+      </w:r>
     </w:p>
     <w:p>
       <w:pPr>
         <w:spacing w:after="40"/>
         <w:jc w:val="center"/>
-      </w:pPr>
-      <w:proofErr w:type="spellStart"/>
-      <w:r>
-        <w:t>Correspondence</w:t>
-      </w:r>
-      <w:proofErr w:type="spellEnd"/>
-      <w:r>
-        <w:t xml:space="preserve">: </w:t>
+        <w:rPr>
+          <w:lang w:val="en-US"/>
+        </w:rPr>
+      </w:pPr>
+      <w:r>
+        <w:rPr>
+          <w:lang w:val="en-US"/>
+        </w:rPr>
+        <w:t xml:space="preserve">Correspondence: </w:t>
       </w:r>
       <w:hyperlink r:id="rId7" w:history="1">
         <w:r>
           <w:rPr>
             <w:rStyle w:val="Hyperlink"/>
+            <w:lang w:val="en-US"/>
           </w:rPr>
           <w:t>g4bfernandoo@gmail.com</w:t>
         </w:r>
@@ -131,21 +126,8 @@
           <w:szCs w:val="22"/>
           <w:lang w:val="en-US"/>
         </w:rPr>
-        <w:t>Data availability: All data are publicly available via DATASUS and IBGE. Analysis code: github.com/g4bfernandoo/regional-health-disparities-</w:t>
-      </w:r>
-      <w:proofErr w:type="spellStart"/>
-      <w:r>
-        <w:rPr>
-          <w:i/>
-          <w:iCs/>
-          <w:color w:val="566573"/>
-          <w:sz w:val="22"/>
-          <w:szCs w:val="22"/>
-          <w:lang w:val="en-US"/>
-        </w:rPr>
-        <w:t>brazil</w:t>
-      </w:r>
-      <w:proofErr w:type="spellEnd"/>
+        <w:t>Data availability: All data are publicly available via DATASUS and IBGE. Analysis code: github.com/g4bfernandoo/regional-health-disparities-brazil</w:t>
+      </w:r>
     </w:p>
     <w:p>
       <w:pPr>
@@ -209,35 +191,7 @@
         <w:rPr>
           <w:lang w:val="en-US"/>
         </w:rPr>
-        <w:t>We analyzed cardiovascular mortality (ICD-10 I20–I25), cardiac catheterization procedures (SIH-SUS), population estimates, and gross domestic product data for all 144 municipalities in Pará between 2019 and 2023, obtained from DATASUS and the Brazilian Institute of Geography and Statistics (IBGE). Municipalities with catheterization infrastructure (</w:t>
-      </w:r>
-      <w:proofErr w:type="spellStart"/>
-      <w:r>
-        <w:rPr>
-          <w:lang w:val="en-US"/>
-        </w:rPr>
-        <w:t>Belém</w:t>
-      </w:r>
-      <w:proofErr w:type="spellEnd"/>
-      <w:r>
-        <w:rPr>
-          <w:lang w:val="en-US"/>
-        </w:rPr>
-        <w:t xml:space="preserve"> and </w:t>
-      </w:r>
-      <w:proofErr w:type="spellStart"/>
-      <w:r>
-        <w:rPr>
-          <w:lang w:val="en-US"/>
-        </w:rPr>
-        <w:t>Ananindeua</w:t>
-      </w:r>
-      <w:proofErr w:type="spellEnd"/>
-      <w:r>
-        <w:rPr>
-          <w:lang w:val="en-US"/>
-        </w:rPr>
-        <w:t xml:space="preserve">) were classified a priori as regional cardiac reference centers and excluded from cluster analysis. </w:t>
+        <w:t xml:space="preserve">We analyzed cardiovascular mortality (ICD-10 I20–I25), cardiac catheterization procedures (SIH-SUS), population estimates, and gross domestic product data for all 144 municipalities in Pará between 2019 and 2023, obtained from DATASUS and the Brazilian Institute of Geography and Statistics (IBGE). Municipalities with catheterization infrastructure (Belém and Ananindeua) were classified a priori as regional cardiac reference centers and excluded from cluster analysis. </w:t>
       </w:r>
       <w:r>
         <w:rPr>
@@ -466,21 +420,7 @@
           <w:lang w:val="en-US"/>
         </w:rPr>
         <w:lastRenderedPageBreak/>
-        <w:t xml:space="preserve">distributed across 144 municipalities. The state capital, </w:t>
-      </w:r>
-      <w:proofErr w:type="spellStart"/>
-      <w:r>
-        <w:rPr>
-          <w:lang w:val="en-US"/>
-        </w:rPr>
-        <w:t>Belém</w:t>
-      </w:r>
-      <w:proofErr w:type="spellEnd"/>
-      <w:r>
-        <w:rPr>
-          <w:lang w:val="en-US"/>
-        </w:rPr>
-        <w:t>, is a metropolitan area of roughly two million people; the interior includes riverine communities reachable only by boat for weeks at a time. The contrast in healthcare infrastructure between the capital and the interior is correspondingly stark.</w:t>
+        <w:t>distributed across 144 municipalities. The state capital, Belém, is a metropolitan area of roughly two million people; the interior includes riverine communities reachable only by boat for weeks at a time. The contrast in healthcare infrastructure between the capital and the interior is correspondingly stark.</w:t>
       </w:r>
     </w:p>
     <w:p>
@@ -671,119 +611,7 @@
         <w:rPr>
           <w:lang w:val="en-US"/>
         </w:rPr>
-        <w:t xml:space="preserve">We used four publicly available datasets covering all 144 municipalities in Pará for the period January 2019 through December 2023. Cardiovascular mortality data were obtained from the Sistema de </w:t>
-      </w:r>
-      <w:proofErr w:type="spellStart"/>
-      <w:r>
-        <w:rPr>
-          <w:lang w:val="en-US"/>
-        </w:rPr>
-        <w:t>Informação</w:t>
-      </w:r>
-      <w:proofErr w:type="spellEnd"/>
-      <w:r>
-        <w:rPr>
-          <w:lang w:val="en-US"/>
-        </w:rPr>
-        <w:t xml:space="preserve"> </w:t>
-      </w:r>
-      <w:proofErr w:type="spellStart"/>
-      <w:r>
-        <w:rPr>
-          <w:lang w:val="en-US"/>
-        </w:rPr>
-        <w:t>sobre</w:t>
-      </w:r>
-      <w:proofErr w:type="spellEnd"/>
-      <w:r>
-        <w:rPr>
-          <w:lang w:val="en-US"/>
-        </w:rPr>
-        <w:t xml:space="preserve"> </w:t>
-      </w:r>
-      <w:proofErr w:type="spellStart"/>
-      <w:r>
-        <w:rPr>
-          <w:lang w:val="en-US"/>
-        </w:rPr>
-        <w:t>Mortalidade</w:t>
-      </w:r>
-      <w:proofErr w:type="spellEnd"/>
-      <w:r>
-        <w:rPr>
-          <w:lang w:val="en-US"/>
-        </w:rPr>
-        <w:t xml:space="preserve"> (SIM) via DATASUS, restricted to ICD-10 codes I20–I25 (ischemic heart disease, including angina pectoris, acute myocardial infarction, subsequent infarction, and other chronic ischemic forms). Cardiac catheterization procedure data were obtained from the Sistema de </w:t>
-      </w:r>
-      <w:proofErr w:type="spellStart"/>
-      <w:r>
-        <w:rPr>
-          <w:lang w:val="en-US"/>
-        </w:rPr>
-        <w:t>Informação</w:t>
-      </w:r>
-      <w:proofErr w:type="spellEnd"/>
-      <w:r>
-        <w:rPr>
-          <w:lang w:val="en-US"/>
-        </w:rPr>
-        <w:t xml:space="preserve"> </w:t>
-      </w:r>
-      <w:proofErr w:type="spellStart"/>
-      <w:r>
-        <w:rPr>
-          <w:lang w:val="en-US"/>
-        </w:rPr>
-        <w:t>Hospitalar</w:t>
-      </w:r>
-      <w:proofErr w:type="spellEnd"/>
-      <w:r>
-        <w:rPr>
-          <w:lang w:val="en-US"/>
-        </w:rPr>
-        <w:t xml:space="preserve"> (SIH-SUS) via DATASUS, using procedure codes corresponding to cardiac catheterization approved as Hospital Admission Authorizations (</w:t>
-      </w:r>
-      <w:proofErr w:type="spellStart"/>
-      <w:r>
-        <w:rPr>
-          <w:lang w:val="en-US"/>
-        </w:rPr>
-        <w:t>Autorizações</w:t>
-      </w:r>
-      <w:proofErr w:type="spellEnd"/>
-      <w:r>
-        <w:rPr>
-          <w:lang w:val="en-US"/>
-        </w:rPr>
-        <w:t xml:space="preserve"> de </w:t>
-      </w:r>
-      <w:proofErr w:type="spellStart"/>
-      <w:r>
-        <w:rPr>
-          <w:lang w:val="en-US"/>
-        </w:rPr>
-        <w:t>Internação</w:t>
-      </w:r>
-      <w:proofErr w:type="spellEnd"/>
-      <w:r>
-        <w:rPr>
-          <w:lang w:val="en-US"/>
-        </w:rPr>
-        <w:t xml:space="preserve"> </w:t>
-      </w:r>
-      <w:proofErr w:type="spellStart"/>
-      <w:r>
-        <w:rPr>
-          <w:lang w:val="en-US"/>
-        </w:rPr>
-        <w:t>Hospitalar</w:t>
-      </w:r>
-      <w:proofErr w:type="spellEnd"/>
-      <w:r>
-        <w:rPr>
-          <w:lang w:val="en-US"/>
-        </w:rPr>
-        <w:t>, AIH)</w:t>
+        <w:t>We used four publicly available datasets covering all 144 municipalities in Pará for the period January 2019 through December 2023. Cardiovascular mortality data were obtained from the Sistema de Informação sobre Mortalidade (SIM) via DATASUS, restricted to ICD-10 codes I20–I25 (ischemic heart disease, including angina pectoris, acute myocardial infarction, subsequent infarction, and other chronic ischemic forms). Cardiac catheterization procedure data were obtained from the Sistema de Informação Hospitalar (SIH-SUS) via DATASUS, using procedure codes corresponding to cardiac catheterization approved as Hospital Admission Authorizations (Autorizações de Internação Hospitalar, AIH)</w:t>
       </w:r>
       <w:r>
         <w:rPr>
@@ -802,35 +630,7 @@
           <w:lang w:val="en-US"/>
         </w:rPr>
         <w:lastRenderedPageBreak/>
-        <w:t xml:space="preserve">population estimates for 2021 were obtained from IBGE (Table 6579, </w:t>
-      </w:r>
-      <w:proofErr w:type="spellStart"/>
-      <w:r>
-        <w:rPr>
-          <w:lang w:val="en-US"/>
-        </w:rPr>
-        <w:t>Estimativas</w:t>
-      </w:r>
-      <w:proofErr w:type="spellEnd"/>
-      <w:r>
-        <w:rPr>
-          <w:lang w:val="en-US"/>
-        </w:rPr>
-        <w:t xml:space="preserve"> de </w:t>
-      </w:r>
-      <w:proofErr w:type="spellStart"/>
-      <w:r>
-        <w:rPr>
-          <w:lang w:val="en-US"/>
-        </w:rPr>
-        <w:t>População</w:t>
-      </w:r>
-      <w:proofErr w:type="spellEnd"/>
-      <w:r>
-        <w:rPr>
-          <w:lang w:val="en-US"/>
-        </w:rPr>
-        <w:t>). Municipal GDP for 2019–2023 was obtained from IBGE (municipal GDP series)</w:t>
+        <w:t>population estimates for 2021 were obtained from IBGE (Table 6579, Estimativas de População). Municipal GDP for 2019–2023 was obtained from IBGE (municipal GDP series)</w:t>
       </w:r>
       <w:r>
         <w:rPr>
@@ -842,35 +642,7 @@
         <w:rPr>
           <w:lang w:val="en-US"/>
         </w:rPr>
-        <w:t xml:space="preserve">. All data are publicly available under Brazil's Lei de </w:t>
-      </w:r>
-      <w:proofErr w:type="spellStart"/>
-      <w:r>
-        <w:rPr>
-          <w:lang w:val="en-US"/>
-        </w:rPr>
-        <w:t>Acesso</w:t>
-      </w:r>
-      <w:proofErr w:type="spellEnd"/>
-      <w:r>
-        <w:rPr>
-          <w:lang w:val="en-US"/>
-        </w:rPr>
-        <w:t xml:space="preserve"> à </w:t>
-      </w:r>
-      <w:proofErr w:type="spellStart"/>
-      <w:r>
-        <w:rPr>
-          <w:lang w:val="en-US"/>
-        </w:rPr>
-        <w:t>Informação</w:t>
-      </w:r>
-      <w:proofErr w:type="spellEnd"/>
-      <w:r>
-        <w:rPr>
-          <w:lang w:val="en-US"/>
-        </w:rPr>
-        <w:t xml:space="preserve"> (Law 12,527/2011).</w:t>
+        <w:t>. All data are publicly available under Brazil's Lei de Acesso à Informação (Law 12,527/2011).</w:t>
       </w:r>
     </w:p>
     <w:p>
@@ -960,21 +732,7 @@
         <w:rPr>
           <w:lang w:val="en-US"/>
         </w:rPr>
-        <w:t xml:space="preserve">Four features were constructed. The mortality growth trend was operationalized using a two-year block comparison rather than single-year endpoints, to mitigate the small-numbers effect in low-population municipalities. We calculated the mean deaths in 2019–2020 as the baseline and the mean of 2022–2023 as the endpoint, with Laplace smoothing (+1) in the denominator: </w:t>
-      </w:r>
-      <w:proofErr w:type="spellStart"/>
-      <w:r>
-        <w:rPr>
-          <w:lang w:val="en-US"/>
-        </w:rPr>
-        <w:t>crescimento_suavizado</w:t>
-      </w:r>
-      <w:proofErr w:type="spellEnd"/>
-      <w:r>
-        <w:rPr>
-          <w:lang w:val="en-US"/>
-        </w:rPr>
-        <w:t xml:space="preserve"> = (mean₂₀₂₂₋₂₀₂₃ − mean₂₀₁₉₋₂₀₂₀) / (mean₂₀₁₉₋₂₀₂₀ + 1) × 100.</w:t>
+        <w:t>Four features were constructed. The mortality growth trend was operationalized using a two-year block comparison rather than single-year endpoints, to mitigate the small-numbers effect in low-population municipalities. We calculated the mean deaths in 2019–2020 as the baseline and the mean of 2022–2023 as the endpoint, with Laplace smoothing (+1) in the denominator: crescimento_suavizado = (mean₂₀₂₂₋₂₀₂₃ − mean₂₀₁₉₋₂₀₂₀) / (mean₂₀₁₉₋₂₀₂₀ + 1) × 100.</w:t>
       </w:r>
     </w:p>
     <w:p>
@@ -1054,47 +812,11 @@
           <w:lang w:val="en-US"/>
         </w:rPr>
       </w:pPr>
-      <w:proofErr w:type="spellStart"/>
-      <w:r>
-        <w:rPr>
-          <w:lang w:val="en-US"/>
-        </w:rPr>
-        <w:t>Belém</w:t>
-      </w:r>
-      <w:proofErr w:type="spellEnd"/>
-      <w:r>
-        <w:rPr>
-          <w:lang w:val="en-US"/>
-        </w:rPr>
-        <w:t xml:space="preserve"> and </w:t>
-      </w:r>
-      <w:proofErr w:type="spellStart"/>
-      <w:r>
-        <w:rPr>
-          <w:lang w:val="en-US"/>
-        </w:rPr>
-        <w:t>Ananindeua</w:t>
-      </w:r>
-      <w:proofErr w:type="spellEnd"/>
-      <w:r>
-        <w:rPr>
-          <w:lang w:val="en-US"/>
-        </w:rPr>
-        <w:t xml:space="preserve"> — the only municipalities with recorded catheterization procedures — were excluded from clustering and classified a priori as regional cardiac reference centers. Including them produced a trivial two-group solution (one group containing only </w:t>
-      </w:r>
-      <w:proofErr w:type="spellStart"/>
-      <w:r>
-        <w:rPr>
-          <w:lang w:val="en-US"/>
-        </w:rPr>
-        <w:t>Belém</w:t>
-      </w:r>
-      <w:proofErr w:type="spellEnd"/>
-      <w:r>
-        <w:rPr>
-          <w:lang w:val="en-US"/>
-        </w:rPr>
-        <w:t>) driven entirely by procedure volume rather than revealing health profile heterogeneity among underserved municipalities. This exclusion is stated explicitly so that readers can assess its appropriateness; the two reference centers are described separately in the Results section. The cluster analysis characterizes the 142 municipalities with no catheterization infrastructure.</w:t>
+      <w:r>
+        <w:rPr>
+          <w:lang w:val="en-US"/>
+        </w:rPr>
+        <w:t>Belém and Ananindeua — the only municipalities with recorded catheterization procedures — were excluded from clustering and classified a priori as regional cardiac reference centers. Including them produced a trivial two-group solution (one group containing only Belém) driven entirely by procedure volume rather than revealing health profile heterogeneity among underserved municipalities. This exclusion is stated explicitly so that readers can assess its appropriateness; the two reference centers are described separately in the Results section. The cluster analysis characterizes the 142 municipalities with no catheterization infrastructure.</w:t>
       </w:r>
     </w:p>
     <w:p>
@@ -1161,21 +883,7 @@
           <w:lang w:val="en-US"/>
         </w:rPr>
         <w:lastRenderedPageBreak/>
-        <w:t xml:space="preserve">subset. A zero-variance feature produces a null vector after </w:t>
-      </w:r>
-      <w:proofErr w:type="spellStart"/>
-      <w:r>
-        <w:rPr>
-          <w:lang w:val="en-US"/>
-        </w:rPr>
-        <w:t>StandardScaler</w:t>
-      </w:r>
-      <w:proofErr w:type="spellEnd"/>
-      <w:r>
-        <w:rPr>
-          <w:lang w:val="en-US"/>
-        </w:rPr>
-        <w:t xml:space="preserve"> normalization, contributing no information to K-Means Euclidean distance calculations while introducing a logical inconsistency between the Methods and Results sections. The variable was therefore excluded from the clustering model and is described separately in the Results as a descriptive characteristic of the study population. Three features were used in the final model: cardiovascular mortality rate, log-transformed GDP per capita, and a smoothed five-year mortality growth trend.</w:t>
+        <w:t>subset. A zero-variance feature produces a null vector after StandardScaler normalization, contributing no information to K-Means Euclidean distance calculations while introducing a logical inconsistency between the Methods and Results sections. The variable was therefore excluded from the clustering model and is described separately in the Results as a descriptive characteristic of the study population. Three features were used in the final model: cardiovascular mortality rate, log-transformed GDP per capita, and a smoothed five-year mortality growth trend.</w:t>
       </w:r>
     </w:p>
     <w:p>
@@ -1286,35 +994,13 @@
         <w:rPr>
           <w:lang w:val="en-US"/>
         </w:rPr>
-        <w:t>K-Means internal stability was assessed by re-fitting the algorithm 30 times with different random seeds and computing the Adjusted Rand Index (ARI) between each solution and the reference clustering (</w:t>
-      </w:r>
-      <w:proofErr w:type="spellStart"/>
-      <w:r>
-        <w:rPr>
-          <w:lang w:val="en-US"/>
-        </w:rPr>
-        <w:t>random_state</w:t>
-      </w:r>
-      <w:proofErr w:type="spellEnd"/>
-      <w:r>
-        <w:rPr>
-          <w:lang w:val="en-US"/>
-        </w:rPr>
-        <w:t xml:space="preserve">=42). ARI quantifies agreement between two partitions without requiring label alignment (range: 0 = random, 1 = perfect agreement). Mean ARI across 30 runs was 0.886 (minimum: 0.772), indicating moderate-to-high stability and confirming that the k=4 solution is consistently recovered across initializations rather than dependent on a specific random seed. Supplementary geometric validation included the Davies-Bouldin index (1.056; values ≤1.5 indicate acceptable separation) and the </w:t>
-      </w:r>
-      <w:proofErr w:type="spellStart"/>
-      <w:r>
-        <w:rPr>
-          <w:lang w:val="en-US"/>
-        </w:rPr>
-        <w:t>Calinski-Harabasz</w:t>
-      </w:r>
-      <w:proofErr w:type="spellEnd"/>
-      <w:r>
-        <w:rPr>
-          <w:lang w:val="en-US"/>
-        </w:rPr>
-        <w:t xml:space="preserve"> index (57.7; higher values indicate denser, more separated clusters).</w:t>
+        <w:t>K-Means internal stability was assessed by re-fitting the algorithm 30 times with different random seeds and computing the Adjusted Rand Index (ARI) between each solution and the reference clustering (random_state=42). ARI quantifies agreement between two partitions without requiring label alignment (range: 0 = random, 1 = perfect agreement). Mean ARI across 30 runs was 0.886 (minimum: 0.772), indicating moderate-to-high stability and confirming that the k=4 solution is consistently recovered across initializations rather than dependent on a specific random seed. Supplementary geometric validation included the Davies-Bouldin index (1.056; values ≤1.5 indicate acceptable separation) and the Calinski-Harabasz index (57.7; higher values indicate denser, more separated clusters)</w:t>
+      </w:r>
+      <w:r>
+        <w:rPr>
+          <w:lang w:val="en-US"/>
+        </w:rPr>
+        <w:t>.</w:t>
       </w:r>
     </w:p>
     <w:p>
@@ -1335,47 +1021,73 @@
           <w:szCs w:val="24"/>
           <w:lang w:val="en-US"/>
         </w:rPr>
-        <w:t>Artificial Intelligence Use Statement</w:t>
-      </w:r>
-    </w:p>
-    <w:p>
-      <w:pPr>
-        <w:spacing w:after="120" w:line="360" w:lineRule="auto"/>
-        <w:jc w:val="both"/>
-        <w:rPr>
-          <w:lang w:val="en-US"/>
-        </w:rPr>
-      </w:pPr>
-      <w:r>
-        <w:rPr>
-          <w:lang w:val="en-US"/>
-        </w:rPr>
-        <w:t xml:space="preserve">Artificial Intelligence </w:t>
-      </w:r>
-      <w:r>
-        <w:rPr>
-          <w:lang w:val="en-US"/>
-        </w:rPr>
-        <w:t>writing assistance tools were used in the preparation of this manuscript for grammar checking and language editing. All scientific content, analysis, interpretations, and conclusions are the sole responsibility of the author. No AI tool was used to generate, fabricate, or alter data or results.</w:t>
-      </w:r>
-    </w:p>
-    <w:p>
-      <w:pPr>
-        <w:spacing w:after="120" w:line="360" w:lineRule="auto"/>
-        <w:jc w:val="both"/>
-        <w:rPr>
-          <w:lang w:val="en-US"/>
-        </w:rPr>
-      </w:pPr>
-    </w:p>
-    <w:p>
-      <w:pPr>
-        <w:spacing w:after="120" w:line="360" w:lineRule="auto"/>
-        <w:jc w:val="both"/>
-        <w:rPr>
-          <w:lang w:val="en-US"/>
-        </w:rPr>
-      </w:pPr>
+        <w:t xml:space="preserve">Ethical </w:t>
+      </w:r>
+      <w:r>
+        <w:rPr>
+          <w:b/>
+          <w:bCs/>
+          <w:i/>
+          <w:iCs/>
+          <w:sz w:val="24"/>
+          <w:szCs w:val="24"/>
+          <w:lang w:val="en-US"/>
+        </w:rPr>
+        <w:t>C</w:t>
+      </w:r>
+      <w:r>
+        <w:rPr>
+          <w:b/>
+          <w:bCs/>
+          <w:i/>
+          <w:iCs/>
+          <w:sz w:val="24"/>
+          <w:szCs w:val="24"/>
+          <w:lang w:val="en-US"/>
+        </w:rPr>
+        <w:t>onsiderations</w:t>
+      </w:r>
+    </w:p>
+    <w:p>
+      <w:pPr>
+        <w:spacing w:after="120" w:line="360" w:lineRule="auto"/>
+        <w:jc w:val="both"/>
+        <w:rPr>
+          <w:lang w:val="en-US"/>
+        </w:rPr>
+      </w:pPr>
+      <w:r>
+        <w:rPr>
+          <w:lang w:val="en-US"/>
+        </w:rPr>
+        <w:t xml:space="preserve">This study uses exclusively publicly available, aggregate, de-identified municipal-level data from DATASUS (Brazilian Ministry of Health) and IBGE (Brazilian Institute of Geography and Statistics), released under Brazil's Lei de Acesso à Informação (Law 12,527/2011). No individually identifiable data were accessed, and no interaction with human subjects occurred at any stage. As the dataset is aggregated at the municipal level and publicly available, formal approval from an Institutional Review Board or Ethics Committee was not required, </w:t>
+      </w:r>
+      <w:r>
+        <w:rPr>
+          <w:lang w:val="en-US"/>
+        </w:rPr>
+        <w:lastRenderedPageBreak/>
+        <w:t>consistent with Brazil's General Data Protection Law (Lei Geral de Proteção de Dados Pessoais, LGPD, Law No. 13,709/2018).</w:t>
+      </w:r>
+    </w:p>
+    <w:p>
+      <w:pPr>
+        <w:pStyle w:val="Ttulo1"/>
+        <w:spacing w:before="240" w:after="120"/>
+        <w:rPr>
+          <w:lang w:val="en-US"/>
+        </w:rPr>
+      </w:pPr>
+      <w:r>
+        <w:rPr>
+          <w:b/>
+          <w:bCs/>
+          <w:sz w:val="28"/>
+          <w:szCs w:val="28"/>
+          <w:lang w:val="en-US"/>
+        </w:rPr>
+        <w:t>RESULTS</w:t>
+      </w:r>
     </w:p>
     <w:p>
       <w:pPr>
@@ -1395,8 +1107,7 @@
           <w:szCs w:val="24"/>
           <w:lang w:val="en-US"/>
         </w:rPr>
-        <w:lastRenderedPageBreak/>
-        <w:t xml:space="preserve">Ethical </w:t>
+        <w:t xml:space="preserve">Procedure </w:t>
       </w:r>
       <w:r>
         <w:rPr>
@@ -1420,155 +1131,6 @@
           <w:szCs w:val="24"/>
           <w:lang w:val="en-US"/>
         </w:rPr>
-        <w:t>onsiderations</w:t>
-      </w:r>
-    </w:p>
-    <w:p>
-      <w:pPr>
-        <w:spacing w:after="120" w:line="360" w:lineRule="auto"/>
-        <w:jc w:val="both"/>
-        <w:rPr>
-          <w:lang w:val="en-US"/>
-        </w:rPr>
-      </w:pPr>
-      <w:r>
-        <w:rPr>
-          <w:lang w:val="en-US"/>
-        </w:rPr>
-        <w:t xml:space="preserve">This study uses exclusively publicly available, aggregate, de-identified municipal-level data from DATASUS (Brazilian Ministry of Health) and IBGE (Brazilian Institute of Geography and Statistics), released under Brazil's Lei de </w:t>
-      </w:r>
-      <w:proofErr w:type="spellStart"/>
-      <w:r>
-        <w:rPr>
-          <w:lang w:val="en-US"/>
-        </w:rPr>
-        <w:t>Acesso</w:t>
-      </w:r>
-      <w:proofErr w:type="spellEnd"/>
-      <w:r>
-        <w:rPr>
-          <w:lang w:val="en-US"/>
-        </w:rPr>
-        <w:t xml:space="preserve"> à </w:t>
-      </w:r>
-      <w:proofErr w:type="spellStart"/>
-      <w:r>
-        <w:rPr>
-          <w:lang w:val="en-US"/>
-        </w:rPr>
-        <w:t>Informação</w:t>
-      </w:r>
-      <w:proofErr w:type="spellEnd"/>
-      <w:r>
-        <w:rPr>
-          <w:lang w:val="en-US"/>
-        </w:rPr>
-        <w:t xml:space="preserve"> (Law 12,527/2011). No individually identifiable data were accessed, and no interaction with human subjects occurred at any stage. As the dataset is aggregated at the municipal level and publicly available, formal approval from an Institutional Review Board or Ethics Committee was not required, consistent with Brazil's General Data Protection Law (Lei </w:t>
-      </w:r>
-      <w:proofErr w:type="spellStart"/>
-      <w:r>
-        <w:rPr>
-          <w:lang w:val="en-US"/>
-        </w:rPr>
-        <w:t>Geral</w:t>
-      </w:r>
-      <w:proofErr w:type="spellEnd"/>
-      <w:r>
-        <w:rPr>
-          <w:lang w:val="en-US"/>
-        </w:rPr>
-        <w:t xml:space="preserve"> de </w:t>
-      </w:r>
-      <w:proofErr w:type="spellStart"/>
-      <w:r>
-        <w:rPr>
-          <w:lang w:val="en-US"/>
-        </w:rPr>
-        <w:t>Proteção</w:t>
-      </w:r>
-      <w:proofErr w:type="spellEnd"/>
-      <w:r>
-        <w:rPr>
-          <w:lang w:val="en-US"/>
-        </w:rPr>
-        <w:t xml:space="preserve"> de Dados </w:t>
-      </w:r>
-      <w:proofErr w:type="spellStart"/>
-      <w:r>
-        <w:rPr>
-          <w:lang w:val="en-US"/>
-        </w:rPr>
-        <w:t>Pessoais</w:t>
-      </w:r>
-      <w:proofErr w:type="spellEnd"/>
-      <w:r>
-        <w:rPr>
-          <w:lang w:val="en-US"/>
-        </w:rPr>
-        <w:t>, LGPD, Law No. 13,709/2018).</w:t>
-      </w:r>
-    </w:p>
-    <w:p>
-      <w:pPr>
-        <w:pStyle w:val="Ttulo1"/>
-        <w:spacing w:before="240" w:after="120"/>
-        <w:rPr>
-          <w:lang w:val="en-US"/>
-        </w:rPr>
-      </w:pPr>
-      <w:r>
-        <w:rPr>
-          <w:b/>
-          <w:bCs/>
-          <w:sz w:val="28"/>
-          <w:szCs w:val="28"/>
-          <w:lang w:val="en-US"/>
-        </w:rPr>
-        <w:t>RESULTS</w:t>
-      </w:r>
-    </w:p>
-    <w:p>
-      <w:pPr>
-        <w:pStyle w:val="Ttulo2"/>
-        <w:spacing w:before="200" w:after="80"/>
-        <w:rPr>
-          <w:lang w:val="en-US"/>
-        </w:rPr>
-      </w:pPr>
-      <w:r>
-        <w:rPr>
-          <w:b/>
-          <w:bCs/>
-          <w:i/>
-          <w:iCs/>
-          <w:sz w:val="24"/>
-          <w:szCs w:val="24"/>
-          <w:lang w:val="en-US"/>
-        </w:rPr>
-        <w:t xml:space="preserve">Procedure </w:t>
-      </w:r>
-      <w:r>
-        <w:rPr>
-          <w:b/>
-          <w:bCs/>
-          <w:i/>
-          <w:iCs/>
-          <w:sz w:val="24"/>
-          <w:szCs w:val="24"/>
-          <w:lang w:val="en-US"/>
-        </w:rPr>
-        <w:t>C</w:t>
-      </w:r>
-      <w:r>
-        <w:rPr>
-          <w:b/>
-          <w:bCs/>
-          <w:i/>
-          <w:iCs/>
-          <w:sz w:val="24"/>
-          <w:szCs w:val="24"/>
-          <w:lang w:val="en-US"/>
-        </w:rPr>
         <w:t>oncentration</w:t>
       </w:r>
     </w:p>
@@ -1584,35 +1146,7 @@
         <w:rPr>
           <w:lang w:val="en-US"/>
         </w:rPr>
-        <w:t xml:space="preserve">Between 2019 and 2023, SUS recorded 5,324 cardiac catheterization procedures in Pará at a total expenditure of R$29.7 million. These procedures were performed exclusively in two municipalities: </w:t>
-      </w:r>
-      <w:proofErr w:type="spellStart"/>
-      <w:r>
-        <w:rPr>
-          <w:lang w:val="en-US"/>
-        </w:rPr>
-        <w:t>Belém</w:t>
-      </w:r>
-      <w:proofErr w:type="spellEnd"/>
-      <w:r>
-        <w:rPr>
-          <w:lang w:val="en-US"/>
-        </w:rPr>
-        <w:t xml:space="preserve"> (n=5,260; 98.8% of the state total) and </w:t>
-      </w:r>
-      <w:proofErr w:type="spellStart"/>
-      <w:r>
-        <w:rPr>
-          <w:lang w:val="en-US"/>
-        </w:rPr>
-        <w:t>Ananindeua</w:t>
-      </w:r>
-      <w:proofErr w:type="spellEnd"/>
-      <w:r>
-        <w:rPr>
-          <w:lang w:val="en-US"/>
-        </w:rPr>
-        <w:t xml:space="preserve"> (n=64; 1.2%). The remaining 142 municipalities — home to the majority of Pará's </w:t>
+        <w:t xml:space="preserve">Between 2019 and 2023, SUS recorded 5,324 cardiac catheterization procedures in Pará at a total expenditure of R$29.7 million. These procedures were performed exclusively in two municipalities: Belém (n=5,260; 98.8% of the state total) and Ananindeua (n=64; 1.2%). The remaining 142 municipalities — home to the majority of Pará's </w:t>
       </w:r>
       <w:r>
         <w:rPr>
@@ -1639,35 +1173,7 @@
         <w:rPr>
           <w:lang w:val="en-US"/>
         </w:rPr>
-        <w:t>Over the same period, 16,677 cardiovascular deaths (ICD-10 I20–I25) were recorded across all 144 municipalities. The mean cardiovascular mortality rate across municipalities was 178.6 deaths per 100,000 inhabitants (SD 74.8), with a range from 48.7 (Aveiro) to 399.7 (</w:t>
-      </w:r>
-      <w:proofErr w:type="spellStart"/>
-      <w:r>
-        <w:rPr>
-          <w:lang w:val="en-US"/>
-        </w:rPr>
-        <w:t>Curionópolis</w:t>
-      </w:r>
-      <w:proofErr w:type="spellEnd"/>
-      <w:r>
-        <w:rPr>
-          <w:lang w:val="en-US"/>
-        </w:rPr>
-        <w:t xml:space="preserve">). There was no correlation between procedure access and mortality burden: the municipalities with the highest mortality rates had no catheterization access, and </w:t>
-      </w:r>
-      <w:proofErr w:type="spellStart"/>
-      <w:r>
-        <w:rPr>
-          <w:lang w:val="en-US"/>
-        </w:rPr>
-        <w:t>Belém</w:t>
-      </w:r>
-      <w:proofErr w:type="spellEnd"/>
-      <w:r>
-        <w:rPr>
-          <w:lang w:val="en-US"/>
-        </w:rPr>
-        <w:t xml:space="preserve"> — which performed 98.8% of procedures — was not among the highest-mortality municipalities in the state</w:t>
+        <w:t>Over the same period, 16,677 cardiovascular deaths (ICD-10 I20–I25) were recorded across all 144 municipalities. The mean cardiovascular mortality rate across municipalities was 178.6 deaths per 100,000 inhabitants (SD 74.8), with a range from 48.7 (Aveiro) to 399.7 (Curionópolis). There was no correlation between procedure access and mortality burden: the municipalities with the highest mortality rates had no catheterization access, and Belém — which performed 98.8% of procedures — was not among the highest-mortality municipalities in the state</w:t>
       </w:r>
       <w:r>
         <w:rPr>
@@ -1689,7 +1195,6 @@
           <w:noProof/>
           <w:lang w:val="en-US"/>
         </w:rPr>
-        <w:lastRenderedPageBreak/>
         <w:drawing>
           <wp:inline distT="0" distB="0" distL="0" distR="0" wp14:anchorId="48170B15" wp14:editId="3AE51DFF">
             <wp:extent cx="5476875" cy="2352675"/>
@@ -1832,6 +1337,7 @@
         <w:rPr>
           <w:lang w:val="en-US"/>
         </w:rPr>
+        <w:lastRenderedPageBreak/>
         <w:t xml:space="preserve">Cardiovascular mortality in Pará increased over the study period. Deaths rose from </w:t>
       </w:r>
       <w:r>
@@ -2014,7 +1520,6 @@
           <w:szCs w:val="24"/>
           <w:lang w:val="en-US"/>
         </w:rPr>
-        <w:lastRenderedPageBreak/>
         <w:t xml:space="preserve">Cluster </w:t>
       </w:r>
       <w:r>
@@ -2129,7 +1634,6 @@
             <w:vAlign w:val="center"/>
           </w:tcPr>
           <w:p>
-            <w:proofErr w:type="spellStart"/>
             <w:r>
               <w:rPr>
                 <w:b/>
@@ -2139,7 +1643,6 @@
               </w:rPr>
               <w:t>Variable</w:t>
             </w:r>
-            <w:proofErr w:type="spellEnd"/>
           </w:p>
         </w:tc>
         <w:tc>
@@ -2150,7 +1653,6 @@
             <w:vAlign w:val="center"/>
           </w:tcPr>
           <w:p>
-            <w:proofErr w:type="spellStart"/>
             <w:r>
               <w:rPr>
                 <w:b/>
@@ -2158,57 +1660,7 @@
                 <w:sz w:val="22"/>
                 <w:szCs w:val="22"/>
               </w:rPr>
-              <w:t>Structural</w:t>
-            </w:r>
-            <w:proofErr w:type="spellEnd"/>
-            <w:r>
-              <w:rPr>
-                <w:b/>
-                <w:bCs/>
-                <w:sz w:val="22"/>
-                <w:szCs w:val="22"/>
-              </w:rPr>
-              <w:t xml:space="preserve"> </w:t>
-            </w:r>
-            <w:proofErr w:type="spellStart"/>
-            <w:r>
-              <w:rPr>
-                <w:b/>
-                <w:bCs/>
-                <w:sz w:val="22"/>
-                <w:szCs w:val="22"/>
-              </w:rPr>
-              <w:t>Care</w:t>
-            </w:r>
-            <w:proofErr w:type="spellEnd"/>
-            <w:r>
-              <w:rPr>
-                <w:b/>
-                <w:bCs/>
-                <w:sz w:val="22"/>
-                <w:szCs w:val="22"/>
-              </w:rPr>
-              <w:t xml:space="preserve"> </w:t>
-            </w:r>
-            <w:proofErr w:type="spellStart"/>
-            <w:r>
-              <w:rPr>
-                <w:b/>
-                <w:bCs/>
-                <w:sz w:val="22"/>
-                <w:szCs w:val="22"/>
-              </w:rPr>
-              <w:t>Desert</w:t>
-            </w:r>
-            <w:proofErr w:type="spellEnd"/>
-            <w:r>
-              <w:rPr>
-                <w:b/>
-                <w:bCs/>
-                <w:sz w:val="22"/>
-                <w:szCs w:val="22"/>
-              </w:rPr>
-              <w:t xml:space="preserve"> (n=</w:t>
+              <w:t>Structural Care Desert (n=</w:t>
             </w:r>
             <w:r>
               <w:rPr>
@@ -2238,7 +1690,6 @@
             <w:vAlign w:val="center"/>
           </w:tcPr>
           <w:p>
-            <w:proofErr w:type="spellStart"/>
             <w:r>
               <w:rPr>
                 <w:b/>
@@ -2246,37 +1697,7 @@
                 <w:sz w:val="22"/>
                 <w:szCs w:val="22"/>
               </w:rPr>
-              <w:t>Rapidly</w:t>
-            </w:r>
-            <w:proofErr w:type="spellEnd"/>
-            <w:r>
-              <w:rPr>
-                <w:b/>
-                <w:bCs/>
-                <w:sz w:val="22"/>
-                <w:szCs w:val="22"/>
-              </w:rPr>
-              <w:t xml:space="preserve"> </w:t>
-            </w:r>
-            <w:proofErr w:type="spellStart"/>
-            <w:r>
-              <w:rPr>
-                <w:b/>
-                <w:bCs/>
-                <w:sz w:val="22"/>
-                <w:szCs w:val="22"/>
-              </w:rPr>
-              <w:t>Deteriorating</w:t>
-            </w:r>
-            <w:proofErr w:type="spellEnd"/>
-            <w:r>
-              <w:rPr>
-                <w:b/>
-                <w:bCs/>
-                <w:sz w:val="22"/>
-                <w:szCs w:val="22"/>
-              </w:rPr>
-              <w:t xml:space="preserve"> (n=</w:t>
+              <w:t>Rapidly Deteriorating (n=</w:t>
             </w:r>
             <w:r>
               <w:rPr>
@@ -2313,47 +1734,7 @@
                 <w:sz w:val="22"/>
                 <w:szCs w:val="22"/>
               </w:rPr>
-              <w:t>High-</w:t>
-            </w:r>
-            <w:proofErr w:type="spellStart"/>
-            <w:r>
-              <w:rPr>
-                <w:b/>
-                <w:bCs/>
-                <w:sz w:val="22"/>
-                <w:szCs w:val="22"/>
-              </w:rPr>
-              <w:t>Mortality</w:t>
-            </w:r>
-            <w:proofErr w:type="spellEnd"/>
-            <w:r>
-              <w:rPr>
-                <w:b/>
-                <w:bCs/>
-                <w:sz w:val="22"/>
-                <w:szCs w:val="22"/>
-              </w:rPr>
-              <w:t xml:space="preserve"> </w:t>
-            </w:r>
-            <w:proofErr w:type="spellStart"/>
-            <w:r>
-              <w:rPr>
-                <w:b/>
-                <w:bCs/>
-                <w:sz w:val="22"/>
-                <w:szCs w:val="22"/>
-              </w:rPr>
-              <w:t>Corridor</w:t>
-            </w:r>
-            <w:proofErr w:type="spellEnd"/>
-            <w:r>
-              <w:rPr>
-                <w:b/>
-                <w:bCs/>
-                <w:sz w:val="22"/>
-                <w:szCs w:val="22"/>
-              </w:rPr>
-              <w:t xml:space="preserve"> (n=</w:t>
+              <w:t>High-Mortality Corridor (n=</w:t>
             </w:r>
             <w:r>
               <w:rPr>
@@ -2390,7 +1771,6 @@
                 <w:szCs w:val="22"/>
               </w:rPr>
             </w:pPr>
-            <w:proofErr w:type="spellStart"/>
             <w:r>
               <w:rPr>
                 <w:b/>
@@ -2398,57 +1778,7 @@
                 <w:sz w:val="22"/>
                 <w:szCs w:val="22"/>
               </w:rPr>
-              <w:t>Critical</w:t>
-            </w:r>
-            <w:proofErr w:type="spellEnd"/>
-            <w:r>
-              <w:rPr>
-                <w:b/>
-                <w:bCs/>
-                <w:sz w:val="22"/>
-                <w:szCs w:val="22"/>
-              </w:rPr>
-              <w:t xml:space="preserve"> </w:t>
-            </w:r>
-            <w:proofErr w:type="spellStart"/>
-            <w:r>
-              <w:rPr>
-                <w:b/>
-                <w:bCs/>
-                <w:sz w:val="22"/>
-                <w:szCs w:val="22"/>
-              </w:rPr>
-              <w:t>Mortality</w:t>
-            </w:r>
-            <w:proofErr w:type="spellEnd"/>
-            <w:r>
-              <w:rPr>
-                <w:b/>
-                <w:bCs/>
-                <w:sz w:val="22"/>
-                <w:szCs w:val="22"/>
-              </w:rPr>
-              <w:t xml:space="preserve"> </w:t>
-            </w:r>
-            <w:proofErr w:type="spellStart"/>
-            <w:r>
-              <w:rPr>
-                <w:b/>
-                <w:bCs/>
-                <w:sz w:val="22"/>
-                <w:szCs w:val="22"/>
-              </w:rPr>
-              <w:t>Burden</w:t>
-            </w:r>
-            <w:proofErr w:type="spellEnd"/>
-            <w:r>
-              <w:rPr>
-                <w:b/>
-                <w:bCs/>
-                <w:sz w:val="22"/>
-                <w:szCs w:val="22"/>
-              </w:rPr>
-              <w:t xml:space="preserve"> (n=36)</w:t>
+              <w:t>Critical Mortality Burden (n=36)</w:t>
             </w:r>
           </w:p>
         </w:tc>
@@ -2467,27 +1797,7 @@
                 <w:sz w:val="22"/>
                 <w:szCs w:val="22"/>
               </w:rPr>
-              <w:t>p-</w:t>
-            </w:r>
-            <w:proofErr w:type="spellStart"/>
-            <w:r>
-              <w:rPr>
-                <w:b/>
-                <w:bCs/>
-                <w:sz w:val="22"/>
-                <w:szCs w:val="22"/>
-              </w:rPr>
-              <w:t>value</w:t>
-            </w:r>
-            <w:proofErr w:type="spellEnd"/>
-            <w:r>
-              <w:rPr>
-                <w:b/>
-                <w:bCs/>
-                <w:sz w:val="22"/>
-                <w:szCs w:val="22"/>
-              </w:rPr>
-              <w:t xml:space="preserve"> (ANOVA)</w:t>
+              <w:t>p-value (ANOVA)</w:t>
             </w:r>
           </w:p>
         </w:tc>
@@ -2777,32 +2087,13 @@
             <w:vAlign w:val="center"/>
           </w:tcPr>
           <w:p>
-            <w:proofErr w:type="spellStart"/>
             <w:r>
               <w:rPr>
                 <w:sz w:val="22"/>
                 <w:szCs w:val="22"/>
               </w:rPr>
-              <w:t>Mortality</w:t>
+              <w:t xml:space="preserve">Mortality growth </w:t>
             </w:r>
-            <w:proofErr w:type="spellEnd"/>
-            <w:r>
-              <w:rPr>
-                <w:sz w:val="22"/>
-                <w:szCs w:val="22"/>
-              </w:rPr>
-              <w:t xml:space="preserve"> </w:t>
-            </w:r>
-            <w:proofErr w:type="spellStart"/>
-            <w:proofErr w:type="gramStart"/>
-            <w:r>
-              <w:rPr>
-                <w:sz w:val="22"/>
-                <w:szCs w:val="22"/>
-              </w:rPr>
-              <w:t>growth</w:t>
-            </w:r>
-            <w:proofErr w:type="spellEnd"/>
             <w:r>
               <w:rPr>
                 <w:sz w:val="22"/>
@@ -2815,22 +2106,7 @@
                 <w:sz w:val="22"/>
                 <w:szCs w:val="22"/>
               </w:rPr>
-              <w:t xml:space="preserve"> </w:t>
-            </w:r>
-            <w:r>
-              <w:rPr>
-                <w:sz w:val="22"/>
-                <w:szCs w:val="22"/>
-              </w:rPr>
-              <w:t>(</w:t>
-            </w:r>
-            <w:proofErr w:type="gramEnd"/>
-            <w:r>
-              <w:rPr>
-                <w:sz w:val="22"/>
-                <w:szCs w:val="22"/>
-              </w:rPr>
-              <w:t>%)</w:t>
+              <w:t>(%)</w:t>
             </w:r>
           </w:p>
         </w:tc>
@@ -2958,37 +2234,12 @@
             <w:vAlign w:val="center"/>
           </w:tcPr>
           <w:p>
-            <w:proofErr w:type="spellStart"/>
             <w:r>
               <w:rPr>
                 <w:sz w:val="22"/>
                 <w:szCs w:val="22"/>
               </w:rPr>
-              <w:t>Mean</w:t>
-            </w:r>
-            <w:proofErr w:type="spellEnd"/>
-            <w:r>
-              <w:rPr>
-                <w:sz w:val="22"/>
-                <w:szCs w:val="22"/>
-              </w:rPr>
-              <w:t xml:space="preserve"> </w:t>
-            </w:r>
-            <w:proofErr w:type="spellStart"/>
-            <w:r>
-              <w:rPr>
-                <w:sz w:val="22"/>
-                <w:szCs w:val="22"/>
-              </w:rPr>
-              <w:t>population</w:t>
-            </w:r>
-            <w:proofErr w:type="spellEnd"/>
-            <w:r>
-              <w:rPr>
-                <w:sz w:val="22"/>
-                <w:szCs w:val="22"/>
-              </w:rPr>
-              <w:t xml:space="preserve"> (2021)</w:t>
+              <w:t>Mean population (2021)</w:t>
             </w:r>
           </w:p>
         </w:tc>
@@ -3137,6 +2388,7 @@
           <w:sz w:val="21"/>
           <w:szCs w:val="21"/>
         </w:rPr>
+        <w:lastRenderedPageBreak/>
         <w:drawing>
           <wp:inline distT="0" distB="0" distL="0" distR="0" wp14:anchorId="284304A7" wp14:editId="2E163291">
             <wp:extent cx="5476875" cy="3152775"/>
@@ -3218,51 +2470,7 @@
           <w:szCs w:val="22"/>
           <w:lang w:val="en-US"/>
         </w:rPr>
-        <w:t xml:space="preserve"> Left: K-Means cluster assignments (k=4) across 144 municipalities. Reference centers (</w:t>
-      </w:r>
-      <w:proofErr w:type="spellStart"/>
-      <w:r>
-        <w:rPr>
-          <w:i/>
-          <w:iCs/>
-          <w:sz w:val="22"/>
-          <w:szCs w:val="22"/>
-          <w:lang w:val="en-US"/>
-        </w:rPr>
-        <w:t>Belém</w:t>
-      </w:r>
-      <w:proofErr w:type="spellEnd"/>
-      <w:r>
-        <w:rPr>
-          <w:i/>
-          <w:iCs/>
-          <w:sz w:val="22"/>
-          <w:szCs w:val="22"/>
-          <w:lang w:val="en-US"/>
-        </w:rPr>
-        <w:t xml:space="preserve"> and </w:t>
-      </w:r>
-      <w:proofErr w:type="spellStart"/>
-      <w:r>
-        <w:rPr>
-          <w:i/>
-          <w:iCs/>
-          <w:sz w:val="22"/>
-          <w:szCs w:val="22"/>
-          <w:lang w:val="en-US"/>
-        </w:rPr>
-        <w:t>Ananindeua</w:t>
-      </w:r>
-      <w:proofErr w:type="spellEnd"/>
-      <w:r>
-        <w:rPr>
-          <w:i/>
-          <w:iCs/>
-          <w:sz w:val="22"/>
-          <w:szCs w:val="22"/>
-          <w:lang w:val="en-US"/>
-        </w:rPr>
-        <w:t>) shown in navy. Right: cardiovascular mortality rate choropleth (darker red = higher mortality).</w:t>
+        <w:t xml:space="preserve"> Left: K-Means cluster assignments (k=4) across 144 municipalities. Reference centers (Belém and Ananindeua) shown in navy. Right: cardiovascular mortality rate choropleth (darker red = higher mortality).</w:t>
       </w:r>
     </w:p>
     <w:p>
@@ -3285,159 +2493,61 @@
         <w:rPr>
           <w:lang w:val="en-US"/>
         </w:rPr>
-        <w:t xml:space="preserve"> Twenty-one municipalities had above-average cardiovascular mortality (203.3 per 100,000) alongside the highest mean GDP </w:t>
+        <w:t xml:space="preserve"> Twenty-one municipalities had above-average cardiovascular mortality (203.3 per 100,000) alongside the highest mean GDP per capita in the analysis (R$693,864) — a figure inflated by Canaã dos Carajás (S11D iron ore complex, GDP per capita R$4.7M) and Parauapebas, but the mortality elevation persists even when these outliers are excluded. Stable growth trend (</w:t>
+      </w:r>
+      <w:r>
+        <w:rPr>
+          <w:lang w:val="en-US"/>
+        </w:rPr>
+        <w:t>14.7</w:t>
+      </w:r>
+      <w:r>
+        <w:rPr>
+          <w:lang w:val="en-US"/>
+        </w:rPr>
+        <w:t>%) indicates that high mortality is structurally embedded rather than recently worsening. Economic activity in this corridor is concentrated in mineral extraction and commercial agriculture — industries associated with large male working-age populations at elevated cardiovascular risk whose occupational health programs are typically not integrated into SUS.</w:t>
+      </w:r>
+    </w:p>
+    <w:p>
+      <w:pPr>
+        <w:spacing w:after="120" w:line="360" w:lineRule="auto"/>
+        <w:jc w:val="both"/>
+        <w:rPr>
+          <w:lang w:val="en-US"/>
+        </w:rPr>
+      </w:pPr>
+      <w:r>
+        <w:rPr>
+          <w:b/>
+          <w:bCs/>
+          <w:lang w:val="en-US"/>
+        </w:rPr>
+        <w:t>Cluster 1 — Rapidly Deteriorating Access (n=18).</w:t>
+      </w:r>
+      <w:r>
+        <w:rPr>
+          <w:lang w:val="en-US"/>
+        </w:rPr>
+        <w:t xml:space="preserve"> Eighteen municipalities showed a mean smoothed mortality growth trend of </w:t>
+      </w:r>
+      <w:r>
+        <w:rPr>
+          <w:lang w:val="en-US"/>
+        </w:rPr>
+        <w:t>132.7</w:t>
+      </w:r>
+      <w:r>
+        <w:rPr>
+          <w:lang w:val="en-US"/>
+        </w:rPr>
+        <w:t xml:space="preserve">% over the study period despite mortality rates initially below the state mean (159.5 per 100,000). This trajectory indicates municipalities that were not the worst performers at the start of the period but experienced structural collapse in cardiovascular outcomes during it, likely amplified by COVID-19 disruption in health systems with limited pre-existing resilience. Conceição do Araguaia, Bragança, Salinópolis, </w:t>
       </w:r>
       <w:r>
         <w:rPr>
           <w:lang w:val="en-US"/>
         </w:rPr>
         <w:lastRenderedPageBreak/>
-        <w:t xml:space="preserve">per capita in the analysis (R$693,864) — a figure inflated by </w:t>
-      </w:r>
-      <w:proofErr w:type="spellStart"/>
-      <w:r>
-        <w:rPr>
-          <w:lang w:val="en-US"/>
-        </w:rPr>
-        <w:t>Canaã</w:t>
-      </w:r>
-      <w:proofErr w:type="spellEnd"/>
-      <w:r>
-        <w:rPr>
-          <w:lang w:val="en-US"/>
-        </w:rPr>
-        <w:t xml:space="preserve"> dos </w:t>
-      </w:r>
-      <w:proofErr w:type="spellStart"/>
-      <w:r>
-        <w:rPr>
-          <w:lang w:val="en-US"/>
-        </w:rPr>
-        <w:t>Carajás</w:t>
-      </w:r>
-      <w:proofErr w:type="spellEnd"/>
-      <w:r>
-        <w:rPr>
-          <w:lang w:val="en-US"/>
-        </w:rPr>
-        <w:t xml:space="preserve"> (S11D iron ore complex, GDP per capita R$4.7M) and </w:t>
-      </w:r>
-      <w:proofErr w:type="spellStart"/>
-      <w:r>
-        <w:rPr>
-          <w:lang w:val="en-US"/>
-        </w:rPr>
-        <w:t>Parauapebas</w:t>
-      </w:r>
-      <w:proofErr w:type="spellEnd"/>
-      <w:r>
-        <w:rPr>
-          <w:lang w:val="en-US"/>
-        </w:rPr>
-        <w:t>, but the mortality elevation persists even when these outliers are excluded. Stable growth trend (</w:t>
-      </w:r>
-      <w:r>
-        <w:rPr>
-          <w:lang w:val="en-US"/>
-        </w:rPr>
-        <w:t>14.7</w:t>
-      </w:r>
-      <w:r>
-        <w:rPr>
-          <w:lang w:val="en-US"/>
-        </w:rPr>
-        <w:t>%) indicates that high mortality is structurally embedded rather than recently worsening. Economic activity in this corridor is concentrated in mineral extraction and commercial agriculture — industries associated with large male working-age populations at elevated cardiovascular risk whose occupational health programs are typically not integrated into SUS.</w:t>
-      </w:r>
-    </w:p>
-    <w:p>
-      <w:pPr>
-        <w:spacing w:after="120" w:line="360" w:lineRule="auto"/>
-        <w:jc w:val="both"/>
-        <w:rPr>
-          <w:lang w:val="en-US"/>
-        </w:rPr>
-      </w:pPr>
-      <w:r>
-        <w:rPr>
-          <w:b/>
-          <w:bCs/>
-          <w:lang w:val="en-US"/>
-        </w:rPr>
-        <w:t>Cluster 1 — Rapidly Deteriorating Access (n=18).</w:t>
-      </w:r>
-      <w:r>
-        <w:rPr>
-          <w:lang w:val="en-US"/>
-        </w:rPr>
-        <w:t xml:space="preserve"> Eighteen municipalities showed a mean smoothed mortality growth trend of </w:t>
-      </w:r>
-      <w:r>
-        <w:rPr>
-          <w:lang w:val="en-US"/>
-        </w:rPr>
-        <w:t>132.7</w:t>
-      </w:r>
-      <w:r>
-        <w:rPr>
-          <w:lang w:val="en-US"/>
-        </w:rPr>
-        <w:t xml:space="preserve">% over the study period despite mortality rates initially below the state mean (159.5 per 100,000). This trajectory indicates municipalities that were not the worst performers at the start of the period but experienced structural collapse in cardiovascular outcomes during it, likely amplified by COVID-19 disruption in health systems with limited pre-existing resilience. </w:t>
-      </w:r>
-      <w:proofErr w:type="spellStart"/>
-      <w:r>
-        <w:rPr>
-          <w:lang w:val="en-US"/>
-        </w:rPr>
-        <w:t>Conceição</w:t>
-      </w:r>
-      <w:proofErr w:type="spellEnd"/>
-      <w:r>
-        <w:rPr>
-          <w:lang w:val="en-US"/>
-        </w:rPr>
-        <w:t xml:space="preserve"> do Araguaia, </w:t>
-      </w:r>
-      <w:proofErr w:type="spellStart"/>
-      <w:r>
-        <w:rPr>
-          <w:lang w:val="en-US"/>
-        </w:rPr>
-        <w:t>Bragança</w:t>
-      </w:r>
-      <w:proofErr w:type="spellEnd"/>
-      <w:r>
-        <w:rPr>
-          <w:lang w:val="en-US"/>
-        </w:rPr>
-        <w:t xml:space="preserve">, </w:t>
-      </w:r>
-      <w:proofErr w:type="spellStart"/>
-      <w:r>
-        <w:rPr>
-          <w:lang w:val="en-US"/>
-        </w:rPr>
-        <w:t>Salinópolis</w:t>
-      </w:r>
-      <w:proofErr w:type="spellEnd"/>
-      <w:r>
-        <w:rPr>
-          <w:lang w:val="en-US"/>
-        </w:rPr>
-        <w:t xml:space="preserve">, and </w:t>
-      </w:r>
-      <w:proofErr w:type="spellStart"/>
-      <w:r>
-        <w:rPr>
-          <w:lang w:val="en-US"/>
-        </w:rPr>
-        <w:t>Inhangapi</w:t>
-      </w:r>
-      <w:proofErr w:type="spellEnd"/>
-      <w:r>
-        <w:rPr>
-          <w:lang w:val="en-US"/>
-        </w:rPr>
-        <w:t xml:space="preserve"> are among the most extreme cases. The small cluster size (n=18) warrants caution in generalization, but the trajectory is statistically robust (F=</w:t>
+        <w:t>and Inhangapi are among the most extreme cases. The small cluster size (n=18) warrants caution in generalization, but the trajectory is statistically robust (F=</w:t>
       </w:r>
       <w:r>
         <w:rPr>
@@ -3472,49 +2582,7 @@
         <w:rPr>
           <w:lang w:val="en-US"/>
         </w:rPr>
-        <w:t xml:space="preserve"> The largest cluster (47.2% of analyzed municipalities) had the lowest mean cardiovascular mortality rate (129.8 per 100,000) and the lowest mean GDP per capita (R$117,222). This cluster encompasses the most economically marginal municipalities in the state, including riverine communities in the </w:t>
-      </w:r>
-      <w:proofErr w:type="spellStart"/>
-      <w:r>
-        <w:rPr>
-          <w:lang w:val="en-US"/>
-        </w:rPr>
-        <w:t>Marajó</w:t>
-      </w:r>
-      <w:proofErr w:type="spellEnd"/>
-      <w:r>
-        <w:rPr>
-          <w:lang w:val="en-US"/>
-        </w:rPr>
-        <w:t xml:space="preserve"> archipelago — Chaves, </w:t>
-      </w:r>
-      <w:proofErr w:type="spellStart"/>
-      <w:r>
-        <w:rPr>
-          <w:lang w:val="en-US"/>
-        </w:rPr>
-        <w:t>Afuá</w:t>
-      </w:r>
-      <w:proofErr w:type="spellEnd"/>
-      <w:r>
-        <w:rPr>
-          <w:lang w:val="en-US"/>
-        </w:rPr>
-        <w:t xml:space="preserve">, </w:t>
-      </w:r>
-      <w:proofErr w:type="spellStart"/>
-      <w:r>
-        <w:rPr>
-          <w:lang w:val="en-US"/>
-        </w:rPr>
-        <w:t>Melgaço</w:t>
-      </w:r>
-      <w:proofErr w:type="spellEnd"/>
-      <w:r>
-        <w:rPr>
-          <w:lang w:val="en-US"/>
-        </w:rPr>
-        <w:t xml:space="preserve">, Aveiro — accessible primarily by river and with severely limited healthcare infrastructure. The stable mortality growth trend (mean </w:t>
+        <w:t xml:space="preserve"> The largest cluster (47.2% of analyzed municipalities) had the lowest mean cardiovascular mortality rate (129.8 per 100,000) and the lowest mean GDP per capita (R$117,222). This cluster encompasses the most economically marginal municipalities in the state, including riverine communities in the Marajó archipelago — Chaves, Afuá, Melgaço, Aveiro — accessible primarily by river and with severely limited healthcare infrastructure. The stable mortality growth trend (mean </w:t>
       </w:r>
       <w:r>
         <w:rPr>
@@ -3586,98 +2654,7 @@
         <w:rPr>
           <w:lang w:val="en-US"/>
         </w:rPr>
-        <w:t xml:space="preserve">Unlike Cluster 0, this profile cannot be explained by economic activity or industrial demographics; unlike Cluster 1, it shows no temporal acceleration. Municipalities include </w:t>
-      </w:r>
-      <w:proofErr w:type="spellStart"/>
-      <w:r>
-        <w:rPr>
-          <w:lang w:val="en-US"/>
-        </w:rPr>
-        <w:t>Irituia</w:t>
-      </w:r>
-      <w:proofErr w:type="spellEnd"/>
-      <w:r>
-        <w:rPr>
-          <w:lang w:val="en-US"/>
-        </w:rPr>
-        <w:t xml:space="preserve">, </w:t>
-      </w:r>
-      <w:proofErr w:type="spellStart"/>
-      <w:r>
-        <w:rPr>
-          <w:lang w:val="en-US"/>
-        </w:rPr>
-        <w:t>Xinguara</w:t>
-      </w:r>
-      <w:proofErr w:type="spellEnd"/>
-      <w:r>
-        <w:rPr>
-          <w:lang w:val="en-US"/>
-        </w:rPr>
-        <w:t xml:space="preserve">, </w:t>
-      </w:r>
-      <w:proofErr w:type="spellStart"/>
-      <w:r>
-        <w:rPr>
-          <w:lang w:val="en-US"/>
-        </w:rPr>
-        <w:t>Bannach</w:t>
-      </w:r>
-      <w:proofErr w:type="spellEnd"/>
-      <w:r>
-        <w:rPr>
-          <w:lang w:val="en-US"/>
-        </w:rPr>
-        <w:t xml:space="preserve">, Monte Alegre, </w:t>
-      </w:r>
-      <w:proofErr w:type="spellStart"/>
-      <w:r>
-        <w:rPr>
-          <w:lang w:val="en-US"/>
-        </w:rPr>
-        <w:t>Soure</w:t>
-      </w:r>
-      <w:proofErr w:type="spellEnd"/>
-      <w:r>
-        <w:rPr>
-          <w:lang w:val="en-US"/>
-        </w:rPr>
-        <w:t xml:space="preserve">, and </w:t>
-      </w:r>
-      <w:proofErr w:type="spellStart"/>
-      <w:r>
-        <w:rPr>
-          <w:lang w:val="en-US"/>
-        </w:rPr>
-        <w:t>Capitão</w:t>
-      </w:r>
-      <w:proofErr w:type="spellEnd"/>
-      <w:r>
-        <w:rPr>
-          <w:lang w:val="en-US"/>
-        </w:rPr>
-        <w:t xml:space="preserve"> </w:t>
-      </w:r>
-      <w:proofErr w:type="spellStart"/>
-      <w:r>
-        <w:rPr>
-          <w:lang w:val="en-US"/>
-        </w:rPr>
-        <w:t>Poço</w:t>
-      </w:r>
-      <w:proofErr w:type="spellEnd"/>
-      <w:r>
-        <w:rPr>
-          <w:lang w:val="en-US"/>
-        </w:rPr>
-        <w:t xml:space="preserve">. The absence of a structural economic or temporal explanation — with high mortality persisting at moderate </w:t>
-      </w:r>
-      <w:r>
-        <w:rPr>
-          <w:lang w:val="en-US"/>
-        </w:rPr>
-        <w:lastRenderedPageBreak/>
-        <w:t>economic levels and stable rates — suggests that unmeasured local health system factors (physician density, primary care coverage, hospital bed availability, treatment quality) are the primary drivers. This cluster represents the most important target for future individual-level investigation using linked SIH-SUS and SIM records.</w:t>
+        <w:t>Unlike Cluster 0, this profile cannot be explained by economic activity or industrial demographics; unlike Cluster 1, it shows no temporal acceleration. Municipalities include Irituia, Xinguara, Bannach, Monte Alegre, Soure, and Capitão Poço. The absence of a structural economic or temporal explanation — with high mortality persisting at moderate economic levels and stable rates — suggests that unmeasured local health system factors (physician density, primary care coverage, hospital bed availability, treatment quality) are the primary drivers. This cluster represents the most important target for future individual-level investigation using linked SIH-SUS and SIM records.</w:t>
       </w:r>
       <w:r>
         <w:rPr>
@@ -3760,7 +2737,14 @@
         <w:rPr>
           <w:lang w:val="en-US"/>
         </w:rPr>
-        <w:t>Whether this geographic concentration causally contributes to the elevated mortality burden observed in the remaining 142 municipalities cannot be established from this ecological study design. The data document co-occurrence, not causation: catheterization is absent where mortality is high, but unmeasured confounders — including patient severity, comorbidity burden, and other system-level factors — are not captured in municipality-level administrative aggregates.</w:t>
+        <w:t xml:space="preserve">Whether </w:t>
+      </w:r>
+      <w:r>
+        <w:rPr>
+          <w:lang w:val="en-US"/>
+        </w:rPr>
+        <w:lastRenderedPageBreak/>
+        <w:t>this geographic concentration causally contributes to the elevated mortality burden observed in the remaining 142 municipalities cannot be established from this ecological study design. The data document co-occurrence, not causation: catheterization is absent where mortality is high, but unmeasured confounders — including patient severity, comorbidity burden, and other system-level factors — are not captured in municipality-level administrative aggregates.</w:t>
       </w:r>
     </w:p>
     <w:p>
@@ -3790,14 +2774,7 @@
         <w:rPr>
           <w:lang w:val="en-US"/>
         </w:rPr>
-        <w:t xml:space="preserve"> identified here require different responses. The 67 municipalities in the Structural Care Desert cluster face chronic, stable underdevelopment of cardiovascular care — a long-term infrastructure problem. The 21 municipalities in the High-Mortality Economic Corridor face a different paradox: economic activity has not translated into health protection, possibly because the workforce health programs of major extractive operations are not integrated into SUS and do not reach the broader population. The 18 municipalities in the Rapidly Deteriorating Access cluster require immediate epidemiological investigation to identify reversible causes of the mortality acceleration. The 36 municipalities in the Critical Mortality Burden cluster — with the highest mortality in the </w:t>
-      </w:r>
-      <w:r>
-        <w:rPr>
-          <w:lang w:val="en-US"/>
-        </w:rPr>
-        <w:lastRenderedPageBreak/>
-        <w:t>state and no structural economic or temporal explanation — represent the most important target for individual-level clinical investigation.</w:t>
+        <w:t xml:space="preserve"> identified here require different responses. The 67 municipalities in the Structural Care Desert cluster face chronic, stable underdevelopment of cardiovascular care — a long-term infrastructure problem. The 21 municipalities in the High-Mortality Economic Corridor face a different paradox: economic activity has not translated into health protection, possibly because the workforce health programs of major extractive operations are not integrated into SUS and do not reach the broader population. The 18 municipalities in the Rapidly Deteriorating Access cluster require immediate epidemiological investigation to identify reversible causes of the mortality acceleration. The 36 municipalities in the Critical Mortality Burden cluster — with the highest mortality in the state and no structural economic or temporal explanation — represent the most important target for individual-level clinical investigation.</w:t>
       </w:r>
     </w:p>
     <w:p>
@@ -3914,7 +2891,14 @@
         <w:rPr>
           <w:lang w:val="en-US"/>
         </w:rPr>
-        <w:t>%) may partly reflect these dynamics concentrated in municipalities that entered the pandemic with the least resilient health systems. Disentangling pandemic effects from pre-existing structural trends is beyond the scope of this analysis but represents an important next step.</w:t>
+        <w:t xml:space="preserve">%) may partly reflect </w:t>
+      </w:r>
+      <w:r>
+        <w:rPr>
+          <w:lang w:val="en-US"/>
+        </w:rPr>
+        <w:lastRenderedPageBreak/>
+        <w:t>these dynamics concentrated in municipalities that entered the pandemic with the least resilient health systems. Disentangling pandemic effects from pre-existing structural trends is beyond the scope of this analysis but represents an important next step.</w:t>
       </w:r>
     </w:p>
     <w:p>
@@ -4036,85 +3020,79 @@
         <w:rPr>
           <w:lang w:val="en-US"/>
         </w:rPr>
-        <w:t xml:space="preserve">Several limitations apply. First, the analysis is ecological: the unit of analysis is the municipality, not the individual. We cannot determine the cardiovascular risk profile, </w:t>
-      </w:r>
+        <w:t>Several limitations apply. First, the analysis is ecological: the unit of analysis is the municipality, not the individual. We cannot determine the cardiovascular risk profile, comorbidities, or care-seeking behavior of the people who died. Municipality-level mortality rates reflect aggregate exposure; individual-level confounders are uncharacterized.</w:t>
+      </w:r>
+    </w:p>
+    <w:p>
+      <w:pPr>
+        <w:spacing w:after="120" w:line="360" w:lineRule="auto"/>
+        <w:jc w:val="both"/>
+        <w:rPr>
+          <w:lang w:val="en-US"/>
+        </w:rPr>
+      </w:pPr>
+      <w:r>
+        <w:rPr>
+          <w:lang w:val="en-US"/>
+        </w:rPr>
+        <w:t xml:space="preserve">Second, population data are from 2021 IBGE estimates; exact values for 2022 and 2023 were unavailable, introducing modest denominator imprecision for later years of the study. </w:t>
+      </w:r>
+    </w:p>
+    <w:p>
+      <w:pPr>
+        <w:spacing w:after="120" w:line="360" w:lineRule="auto"/>
+        <w:jc w:val="both"/>
+        <w:rPr>
+          <w:lang w:val="en-US"/>
+        </w:rPr>
+      </w:pPr>
+      <w:r>
+        <w:rPr>
+          <w:lang w:val="en-US"/>
+        </w:rPr>
+        <w:t>Third, the SIH-SUS procedure data reflect only SUS-funded catheterizations. Private-sector procedures are not captured. In municipalities with more developed private healthcare — primarily the economic corridor cluster — some residents may have accessed private cardiac care not reflected in these data, which would lead us to overestimate the true access gap in those municipalities specifically.</w:t>
+      </w:r>
+    </w:p>
+    <w:p>
+      <w:pPr>
+        <w:spacing w:after="120" w:line="360" w:lineRule="auto"/>
+        <w:jc w:val="both"/>
+        <w:rPr>
+          <w:lang w:val="en-US"/>
+        </w:rPr>
+      </w:pPr>
+      <w:r>
+        <w:rPr>
+          <w:lang w:val="en-US"/>
+        </w:rPr>
+        <w:t>Fourth, the silhouette score of 0.3</w:t>
+      </w:r>
+      <w:r>
+        <w:rPr>
+          <w:lang w:val="en-US"/>
+        </w:rPr>
+        <w:t>05</w:t>
+      </w:r>
+      <w:r>
+        <w:rPr>
+          <w:lang w:val="en-US"/>
+        </w:rPr>
+        <w:t xml:space="preserve"> indicates moderate but not strong cluster separation. This is expected in health geography applications where municipalities exist on a continuum rather than in discrete health categories; it does not invalidate the clustering but indicates that cluster boundaries are gradients rather than sharp divisions. Fifth, this analysis is limited to one state. Generalizability to other Brazilian states or to other large countries with similar geographic structures requires replication.</w:t>
+      </w:r>
+    </w:p>
+    <w:p>
+      <w:pPr>
+        <w:spacing w:after="120" w:line="360" w:lineRule="auto"/>
+        <w:jc w:val="both"/>
+        <w:rPr>
+          <w:lang w:val="en-US"/>
+        </w:rPr>
+      </w:pPr>
       <w:r>
         <w:rPr>
           <w:lang w:val="en-US"/>
         </w:rPr>
         <w:lastRenderedPageBreak/>
-        <w:t>comorbidities, or care-seeking behavior of the people who died. Municipality-level mortality rates reflect aggregate exposure; individual-level confounders are uncharacterized.</w:t>
-      </w:r>
-    </w:p>
-    <w:p>
-      <w:pPr>
-        <w:spacing w:after="120" w:line="360" w:lineRule="auto"/>
-        <w:jc w:val="both"/>
-        <w:rPr>
-          <w:lang w:val="en-US"/>
-        </w:rPr>
-      </w:pPr>
-      <w:r>
-        <w:rPr>
-          <w:lang w:val="en-US"/>
-        </w:rPr>
-        <w:t xml:space="preserve">Second, population data are from 2021 IBGE estimates; exact values for 2022 and 2023 were unavailable, introducing modest denominator imprecision for later years of the study. </w:t>
-      </w:r>
-    </w:p>
-    <w:p>
-      <w:pPr>
-        <w:spacing w:after="120" w:line="360" w:lineRule="auto"/>
-        <w:jc w:val="both"/>
-        <w:rPr>
-          <w:lang w:val="en-US"/>
-        </w:rPr>
-      </w:pPr>
-      <w:r>
-        <w:rPr>
-          <w:lang w:val="en-US"/>
-        </w:rPr>
-        <w:t>Third, the SIH-SUS procedure data reflect only SUS-funded catheterizations. Private-sector procedures are not captured. In municipalities with more developed private healthcare — primarily the economic corridor cluster — some residents may have accessed private cardiac care not reflected in these data, which would lead us to overestimate the true access gap in those municipalities specifically.</w:t>
-      </w:r>
-    </w:p>
-    <w:p>
-      <w:pPr>
-        <w:spacing w:after="120" w:line="360" w:lineRule="auto"/>
-        <w:jc w:val="both"/>
-        <w:rPr>
-          <w:lang w:val="en-US"/>
-        </w:rPr>
-      </w:pPr>
-      <w:r>
-        <w:rPr>
-          <w:lang w:val="en-US"/>
-        </w:rPr>
-        <w:t>Fourth, the silhouette score of 0.3</w:t>
-      </w:r>
-      <w:r>
-        <w:rPr>
-          <w:lang w:val="en-US"/>
-        </w:rPr>
-        <w:t>05</w:t>
-      </w:r>
-      <w:r>
-        <w:rPr>
-          <w:lang w:val="en-US"/>
-        </w:rPr>
-        <w:t xml:space="preserve"> indicates moderate but not strong cluster separation. This is expected in health geography applications where municipalities exist on a continuum rather than in discrete health categories; it does not invalidate the clustering but indicates that cluster boundaries are gradients rather than sharp divisions. Fifth, this analysis is limited to one state. Generalizability to other Brazilian states or to other large countries with similar geographic structures requires replication.</w:t>
-      </w:r>
-    </w:p>
-    <w:p>
-      <w:pPr>
-        <w:spacing w:after="120" w:line="360" w:lineRule="auto"/>
-        <w:jc w:val="both"/>
-        <w:rPr>
-          <w:lang w:val="en-US"/>
-        </w:rPr>
-      </w:pPr>
-      <w:r>
-        <w:rPr>
-          <w:lang w:val="en-US"/>
-        </w:rPr>
         <w:t>The mortality growth metric, despite two-year block averaging and Laplace smoothing, remains sensitive to the small-numbers effect in the lowest-population municipalities. Future iterations should incorporate empirical Bayes smoothing or spatial empirical priors to provide more stable epidemiological trajectories in low-density regions, particularly within the Rapidly Deteriorating cluster.</w:t>
       </w:r>
     </w:p>
@@ -4262,14 +3240,7 @@
         <w:rPr>
           <w:lang w:val="en-US"/>
         </w:rPr>
-        <w:t xml:space="preserve">From a clinical research perspective, the cluster profiles identified here generate testable hypotheses for outcomes research. The High-Mortality Economic Corridor presents an opportunity to examine whether occupational cardiovascular risk in extractive industries — </w:t>
-      </w:r>
-      <w:r>
-        <w:rPr>
-          <w:lang w:val="en-US"/>
-        </w:rPr>
-        <w:lastRenderedPageBreak/>
-        <w:t>documented in global literature for mining and agricultural workers — is detectable at the population level in Brazilian data. The Rapidly Deteriorating cluster raises questions about specific system failures: whether they reflect collapse of primary prevention, loss of key personnel, or infrastructure deterioration. Both questions are addressable with individual-level SUS data linkage, representing natural extensions of this work.</w:t>
+        <w:t>From a clinical research perspective, the cluster profiles identified here generate testable hypotheses for outcomes research. The High-Mortality Economic Corridor presents an opportunity to examine whether occupational cardiovascular risk in extractive industries — documented in global literature for mining and agricultural workers — is detectable at the population level in Brazilian data. The Rapidly Deteriorating cluster raises questions about specific system failures: whether they reflect collapse of primary prevention, loss of key personnel, or infrastructure deterioration. Both questions are addressable with individual-level SUS data linkage, representing natural extensions of this work.</w:t>
       </w:r>
     </w:p>
     <w:p>
@@ -4334,240 +3305,17 @@
         <w:rPr>
           <w:lang w:val="en-US"/>
         </w:rPr>
-        <w:t>These profiles call for differentiated policy responses rather than uniform infrastructure investment. The analysis is fully reproducible from publicly available DATASUS and IBGE data; the code is available at github.com/g4bfernandoo/regional-health-disparities-</w:t>
-      </w:r>
-      <w:proofErr w:type="spellStart"/>
-      <w:r>
-        <w:rPr>
-          <w:lang w:val="en-US"/>
-        </w:rPr>
-        <w:t>brazil</w:t>
-      </w:r>
-      <w:proofErr w:type="spellEnd"/>
-      <w:r>
-        <w:rPr>
-          <w:lang w:val="en-US"/>
-        </w:rPr>
-        <w:t>.</w:t>
-      </w:r>
-    </w:p>
-    <w:p>
-      <w:pPr>
-        <w:spacing w:after="120" w:line="360" w:lineRule="auto"/>
-        <w:jc w:val="both"/>
-        <w:rPr>
-          <w:lang w:val="en-US"/>
-        </w:rPr>
-      </w:pPr>
-    </w:p>
-    <w:p>
-      <w:pPr>
-        <w:spacing w:after="120" w:line="360" w:lineRule="auto"/>
-        <w:jc w:val="both"/>
-        <w:rPr>
-          <w:lang w:val="en-US"/>
-        </w:rPr>
-      </w:pPr>
-    </w:p>
-    <w:p>
-      <w:pPr>
-        <w:spacing w:after="120" w:line="360" w:lineRule="auto"/>
-        <w:jc w:val="both"/>
-        <w:rPr>
-          <w:lang w:val="en-US"/>
-        </w:rPr>
-      </w:pPr>
-    </w:p>
-    <w:p>
-      <w:pPr>
-        <w:pStyle w:val="Ttulo2"/>
-        <w:spacing w:before="240" w:after="120"/>
-        <w:rPr>
-          <w:b/>
-          <w:bCs/>
-          <w:i/>
-          <w:iCs/>
-          <w:sz w:val="24"/>
-          <w:szCs w:val="24"/>
-          <w:lang w:val="en-US"/>
-        </w:rPr>
-      </w:pPr>
-      <w:r>
-        <w:rPr>
-          <w:b/>
-          <w:bCs/>
-          <w:i/>
-          <w:iCs/>
-          <w:sz w:val="24"/>
-          <w:szCs w:val="24"/>
-          <w:lang w:val="en-US"/>
-        </w:rPr>
-        <w:t xml:space="preserve">Data </w:t>
-      </w:r>
-      <w:r>
-        <w:rPr>
-          <w:b/>
-          <w:bCs/>
-          <w:i/>
-          <w:iCs/>
-          <w:sz w:val="24"/>
-          <w:szCs w:val="24"/>
-          <w:lang w:val="en-US"/>
-        </w:rPr>
-        <w:t>Availability Statement</w:t>
-      </w:r>
-    </w:p>
-    <w:p>
-      <w:pPr>
-        <w:spacing w:after="120" w:line="360" w:lineRule="auto"/>
-        <w:jc w:val="both"/>
-        <w:rPr>
-          <w:u w:val="single"/>
-          <w:lang w:val="en-US"/>
-        </w:rPr>
-      </w:pPr>
-      <w:r>
-        <w:rPr>
-          <w:lang w:val="en-US"/>
-        </w:rPr>
-        <w:t xml:space="preserve">All analysis code is publicly available at </w:t>
-      </w:r>
-      <w:hyperlink r:id="rId11" w:history="1">
-        <w:r>
-          <w:rPr>
-            <w:rStyle w:val="Hyperlink"/>
-            <w:lang w:val="en-US"/>
-          </w:rPr>
-          <w:t>github.com/g4bfernandoo/regional-health-disparities-</w:t>
-        </w:r>
-        <w:proofErr w:type="spellStart"/>
-        <w:r>
-          <w:rPr>
-            <w:rStyle w:val="Hyperlink"/>
-            <w:lang w:val="en-US"/>
-          </w:rPr>
-          <w:t>brazil</w:t>
-        </w:r>
-        <w:proofErr w:type="spellEnd"/>
-      </w:hyperlink>
-      <w:r>
-        <w:rPr>
-          <w:lang w:val="en-US"/>
-        </w:rPr>
-        <w:t xml:space="preserve">. Raw data are publicly available from DATASUS and IBGE under Brazil's Lei de </w:t>
-      </w:r>
-      <w:proofErr w:type="spellStart"/>
-      <w:r>
-        <w:rPr>
-          <w:lang w:val="en-US"/>
-        </w:rPr>
-        <w:t>Acesso</w:t>
-      </w:r>
-      <w:proofErr w:type="spellEnd"/>
-      <w:r>
-        <w:rPr>
-          <w:lang w:val="en-US"/>
-        </w:rPr>
-        <w:t xml:space="preserve"> à </w:t>
-      </w:r>
-      <w:proofErr w:type="spellStart"/>
-      <w:r>
-        <w:rPr>
-          <w:lang w:val="en-US"/>
-        </w:rPr>
-        <w:t>Informação</w:t>
-      </w:r>
-      <w:proofErr w:type="spellEnd"/>
-      <w:r>
-        <w:rPr>
-          <w:lang w:val="en-US"/>
-        </w:rPr>
-        <w:t xml:space="preserve"> (Law 12,527/2011).</w:t>
-      </w:r>
-    </w:p>
-    <w:p>
-      <w:pPr>
-        <w:pStyle w:val="Ttulo2"/>
-        <w:spacing w:before="240" w:after="120"/>
-        <w:rPr>
-          <w:b/>
-          <w:bCs/>
-          <w:i/>
-          <w:iCs/>
-          <w:sz w:val="24"/>
-          <w:szCs w:val="24"/>
-          <w:lang w:val="en-US"/>
-        </w:rPr>
-      </w:pPr>
-      <w:r>
-        <w:rPr>
-          <w:b/>
-          <w:bCs/>
-          <w:i/>
-          <w:iCs/>
-          <w:sz w:val="24"/>
-          <w:szCs w:val="24"/>
-          <w:lang w:val="en-US"/>
-        </w:rPr>
-        <w:t>Funding</w:t>
-      </w:r>
-    </w:p>
-    <w:p>
-      <w:pPr>
-        <w:spacing w:after="120" w:line="360" w:lineRule="auto"/>
-        <w:jc w:val="both"/>
-        <w:rPr>
-          <w:lang w:val="en-US"/>
-        </w:rPr>
-      </w:pPr>
-      <w:r>
-        <w:rPr>
-          <w:lang w:val="en-US"/>
-        </w:rPr>
-        <w:t>This research received no external funding.</w:t>
-      </w:r>
-    </w:p>
-    <w:p>
-      <w:pPr>
-        <w:pStyle w:val="Ttulo2"/>
-        <w:spacing w:before="240" w:after="120"/>
-        <w:rPr>
-          <w:b/>
-          <w:bCs/>
-          <w:i/>
-          <w:iCs/>
-          <w:sz w:val="24"/>
-          <w:szCs w:val="24"/>
-          <w:lang w:val="en-US"/>
-        </w:rPr>
-      </w:pPr>
-      <w:r>
-        <w:rPr>
-          <w:b/>
-          <w:bCs/>
-          <w:i/>
-          <w:iCs/>
-          <w:sz w:val="24"/>
-          <w:szCs w:val="24"/>
-          <w:lang w:val="en-US"/>
-        </w:rPr>
-        <w:t>Conflicts of Interest</w:t>
-      </w:r>
-    </w:p>
-    <w:p>
-      <w:pPr>
-        <w:spacing w:after="120" w:line="360" w:lineRule="auto"/>
-        <w:jc w:val="both"/>
-        <w:rPr>
-          <w:lang w:val="en-US"/>
-        </w:rPr>
-      </w:pPr>
-      <w:r>
-        <w:rPr>
-          <w:lang w:val="en-US"/>
-        </w:rPr>
-        <w:t>The author declares no conflicts of interest.</w:t>
-      </w:r>
+        <w:t>These profiles call for differentiated policy responses rather than uniform infrastructure investment. The analysis is fully reproducible from publicly available DATASUS and IBGE data; the code is available at github.com/g4bfernandoo/regional-health-disparities-brazil.</w:t>
+      </w:r>
+    </w:p>
+    <w:p>
+      <w:pPr>
+        <w:spacing w:after="120" w:line="360" w:lineRule="auto"/>
+        <w:jc w:val="both"/>
+        <w:rPr>
+          <w:lang w:val="en-US"/>
+        </w:rPr>
+      </w:pPr>
     </w:p>
     <w:p>
       <w:pPr>
@@ -4590,6 +3338,7 @@
           <w:szCs w:val="28"/>
           <w:lang w:val="en-US"/>
         </w:rPr>
+        <w:lastRenderedPageBreak/>
         <w:t>SUPPORTING</w:t>
       </w:r>
       <w:r>
@@ -4617,7 +3366,6 @@
           <w:bCs/>
           <w:lang w:val="en-US"/>
         </w:rPr>
-        <w:lastRenderedPageBreak/>
         <w:t>S1 Figure.</w:t>
       </w:r>
       <w:r>
@@ -4656,7 +3404,7 @@
                     <pic:cNvPicPr/>
                   </pic:nvPicPr>
                   <pic:blipFill>
-                    <a:blip r:embed="rId12" cstate="print">
+                    <a:blip r:embed="rId11" cstate="print">
                       <a:extLst>
                         <a:ext uri="{28A0092B-C50C-407E-A947-70E740481C1C}">
                           <a14:useLocalDpi xmlns:a14="http://schemas.microsoft.com/office/drawing/2010/main" val="0"/>
@@ -4735,7 +3483,7 @@
                     <pic:cNvPicPr/>
                   </pic:nvPicPr>
                   <pic:blipFill>
-                    <a:blip r:embed="rId13" cstate="print">
+                    <a:blip r:embed="rId12" cstate="print">
                       <a:extLst>
                         <a:ext uri="{28A0092B-C50C-407E-A947-70E740481C1C}">
                           <a14:useLocalDpi xmlns:a14="http://schemas.microsoft.com/office/drawing/2010/main" val="0"/>
@@ -4770,21 +3518,126 @@
           <w:lang w:val="en-US"/>
         </w:rPr>
       </w:pPr>
-    </w:p>
-    <w:p>
-      <w:pPr>
-        <w:spacing w:after="120" w:line="360" w:lineRule="auto"/>
-        <w:jc w:val="both"/>
-        <w:rPr>
-          <w:lang w:val="en-US"/>
-        </w:rPr>
-      </w:pPr>
-      <w:r>
-        <w:rPr>
-          <w:b/>
-          <w:bCs/>
-          <w:lang w:val="en-US"/>
-        </w:rPr>
+      <w:r>
+        <w:rPr>
+          <w:b/>
+          <w:bCs/>
+          <w:lang w:val="en-US"/>
+        </w:rPr>
+        <w:t>S</w:t>
+      </w:r>
+      <w:r>
+        <w:rPr>
+          <w:b/>
+          <w:bCs/>
+          <w:lang w:val="en-US"/>
+        </w:rPr>
+        <w:t>3</w:t>
+      </w:r>
+      <w:r>
+        <w:rPr>
+          <w:b/>
+          <w:bCs/>
+          <w:lang w:val="en-US"/>
+        </w:rPr>
+        <w:t xml:space="preserve"> Figure. </w:t>
+      </w:r>
+      <w:r>
+        <w:rPr>
+          <w:lang w:val="en-US"/>
+        </w:rPr>
+        <w:t>Economic gradient</w:t>
+      </w:r>
+      <w:r>
+        <w:rPr>
+          <w:lang w:val="en-US"/>
+        </w:rPr>
+        <w:t xml:space="preserve"> </w:t>
+      </w:r>
+      <w:r>
+        <w:rPr>
+          <w:lang w:val="en-US"/>
+        </w:rPr>
+        <w:t xml:space="preserve">— </w:t>
+      </w:r>
+      <w:r>
+        <w:rPr>
+          <w:lang w:val="en-US"/>
+        </w:rPr>
+        <w:t>GDP per capita versus cardiovascular mortality rate.</w:t>
+      </w:r>
+    </w:p>
+    <w:p>
+      <w:pPr>
+        <w:spacing w:after="120" w:line="360" w:lineRule="auto"/>
+        <w:jc w:val="both"/>
+        <w:rPr>
+          <w:lang w:val="en-US"/>
+        </w:rPr>
+      </w:pPr>
+      <w:r>
+        <w:rPr>
+          <w:noProof/>
+          <w:lang w:val="en-US"/>
+        </w:rPr>
+        <w:drawing>
+          <wp:inline distT="0" distB="0" distL="0" distR="0" wp14:anchorId="571D7E81" wp14:editId="1E044942">
+            <wp:extent cx="5612130" cy="1999615"/>
+            <wp:effectExtent l="0" t="0" r="7620" b="635"/>
+            <wp:docPr id="7" name="Imagem 7"/>
+            <wp:cNvGraphicFramePr>
+              <a:graphicFrameLocks xmlns:a="http://schemas.openxmlformats.org/drawingml/2006/main" noChangeAspect="1"/>
+            </wp:cNvGraphicFramePr>
+            <a:graphic xmlns:a="http://schemas.openxmlformats.org/drawingml/2006/main">
+              <a:graphicData uri="http://schemas.openxmlformats.org/drawingml/2006/picture">
+                <pic:pic xmlns:pic="http://schemas.openxmlformats.org/drawingml/2006/picture">
+                  <pic:nvPicPr>
+                    <pic:cNvPr id="7" name="Imagem 7"/>
+                    <pic:cNvPicPr/>
+                  </pic:nvPicPr>
+                  <pic:blipFill>
+                    <a:blip r:embed="rId13" cstate="print">
+                      <a:extLst>
+                        <a:ext uri="{28A0092B-C50C-407E-A947-70E740481C1C}">
+                          <a14:useLocalDpi xmlns:a14="http://schemas.microsoft.com/office/drawing/2010/main" val="0"/>
+                        </a:ext>
+                      </a:extLst>
+                    </a:blip>
+                    <a:stretch>
+                      <a:fillRect/>
+                    </a:stretch>
+                  </pic:blipFill>
+                  <pic:spPr>
+                    <a:xfrm>
+                      <a:off x="0" y="0"/>
+                      <a:ext cx="5612130" cy="1999615"/>
+                    </a:xfrm>
+                    <a:prstGeom prst="rect">
+                      <a:avLst/>
+                    </a:prstGeom>
+                  </pic:spPr>
+                </pic:pic>
+              </a:graphicData>
+            </a:graphic>
+          </wp:inline>
+        </w:drawing>
+      </w:r>
+    </w:p>
+    <w:p>
+      <w:pPr>
+        <w:spacing w:after="120" w:line="360" w:lineRule="auto"/>
+        <w:jc w:val="both"/>
+        <w:rPr>
+          <w:lang w:val="en-US"/>
+        </w:rPr>
+      </w:pPr>
+      <w:r>
+        <w:rPr>
+          <w:b/>
+          <w:bCs/>
+          <w:lang w:val="en-US"/>
+        </w:rPr>
+        <w:lastRenderedPageBreak/>
         <w:t>S3 Figure.</w:t>
       </w:r>
       <w:r>
@@ -4819,11 +3672,10 @@
           <w:noProof/>
           <w:lang w:val="en-US"/>
         </w:rPr>
-        <w:lastRenderedPageBreak/>
         <w:drawing>
-          <wp:inline distT="0" distB="0" distL="0" distR="0" wp14:anchorId="6D06A8DA" wp14:editId="48A1D811">
-            <wp:extent cx="5612130" cy="3971925"/>
-            <wp:effectExtent l="0" t="0" r="7620" b="9525"/>
+          <wp:inline distT="0" distB="0" distL="0" distR="0" wp14:anchorId="6D06A8DA" wp14:editId="344EA8FB">
+            <wp:extent cx="4548920" cy="3219450"/>
+            <wp:effectExtent l="0" t="0" r="4445" b="0"/>
             <wp:docPr id="6" name="Imagem 6"/>
             <wp:cNvGraphicFramePr>
               <a:graphicFrameLocks xmlns:a="http://schemas.openxmlformats.org/drawingml/2006/main" noChangeAspect="1"/>
@@ -4850,7 +3702,7 @@
                   <pic:spPr>
                     <a:xfrm>
                       <a:off x="0" y="0"/>
-                      <a:ext cx="5612130" cy="3971925"/>
+                      <a:ext cx="4588334" cy="3247345"/>
                     </a:xfrm>
                     <a:prstGeom prst="rect">
                       <a:avLst/>
@@ -4877,51 +3729,49 @@
           <w:bCs/>
           <w:lang w:val="en-US"/>
         </w:rPr>
-        <w:t xml:space="preserve">S4 Figure. </w:t>
-      </w:r>
-      <w:r>
-        <w:rPr>
-          <w:lang w:val="en-US"/>
-        </w:rPr>
-        <w:t>Economic gradient</w:t>
-      </w:r>
-      <w:r>
-        <w:rPr>
-          <w:lang w:val="en-US"/>
-        </w:rPr>
-        <w:t xml:space="preserve"> </w:t>
-      </w:r>
-      <w:r>
-        <w:rPr>
-          <w:lang w:val="en-US"/>
-        </w:rPr>
-        <w:t xml:space="preserve">— </w:t>
-      </w:r>
-      <w:r>
-        <w:rPr>
-          <w:lang w:val="en-US"/>
-        </w:rPr>
-        <w:t>GDP per capita versus cardiovascular mortality rate.</w:t>
-      </w:r>
-    </w:p>
-    <w:p>
-      <w:pPr>
-        <w:spacing w:after="120" w:line="360" w:lineRule="auto"/>
-        <w:jc w:val="both"/>
-        <w:rPr>
-          <w:lang w:val="en-US"/>
-        </w:rPr>
-      </w:pPr>
-      <w:r>
-        <w:rPr>
+        <w:t>S5 Figure.</w:t>
+      </w:r>
+      <w:r>
+        <w:rPr>
+          <w:lang w:val="en-US"/>
+        </w:rPr>
+        <w:t xml:space="preserve"> Inter-cluster distance heatmap</w:t>
+      </w:r>
+      <w:r>
+        <w:rPr>
+          <w:lang w:val="en-US"/>
+        </w:rPr>
+        <w:t>.</w:t>
+      </w:r>
+    </w:p>
+    <w:p>
+      <w:pPr>
+        <w:spacing w:after="120" w:line="360" w:lineRule="auto"/>
+        <w:jc w:val="both"/>
+        <w:rPr>
+          <w:b/>
+          <w:bCs/>
+          <w:caps/>
+          <w:sz w:val="28"/>
+          <w:szCs w:val="28"/>
+          <w:lang w:val="en-US"/>
+        </w:rPr>
+      </w:pPr>
+      <w:r>
+        <w:rPr>
+          <w:b/>
+          <w:bCs/>
+          <w:caps/>
           <w:noProof/>
+          <w:sz w:val="28"/>
+          <w:szCs w:val="28"/>
           <w:lang w:val="en-US"/>
         </w:rPr>
         <w:drawing>
-          <wp:inline distT="0" distB="0" distL="0" distR="0" wp14:anchorId="1AE06A64" wp14:editId="71D582B5">
-            <wp:extent cx="5612130" cy="1999615"/>
-            <wp:effectExtent l="0" t="0" r="7620" b="635"/>
-            <wp:docPr id="7" name="Imagem 7"/>
+          <wp:inline distT="0" distB="0" distL="0" distR="0" wp14:anchorId="01E1CE0E" wp14:editId="49DED2CE">
+            <wp:extent cx="4666319" cy="4133584"/>
+            <wp:effectExtent l="0" t="0" r="1270" b="635"/>
+            <wp:docPr id="8" name="Imagem 8"/>
             <wp:cNvGraphicFramePr>
               <a:graphicFrameLocks xmlns:a="http://schemas.openxmlformats.org/drawingml/2006/main" noChangeAspect="1"/>
             </wp:cNvGraphicFramePr>
@@ -4929,7 +3779,7 @@
               <a:graphicData uri="http://schemas.openxmlformats.org/drawingml/2006/picture">
                 <pic:pic xmlns:pic="http://schemas.openxmlformats.org/drawingml/2006/picture">
                   <pic:nvPicPr>
-                    <pic:cNvPr id="7" name="Imagem 7"/>
+                    <pic:cNvPr id="8" name="Imagem 8"/>
                     <pic:cNvPicPr/>
                   </pic:nvPicPr>
                   <pic:blipFill>
@@ -4947,7 +3797,7 @@
                   <pic:spPr>
                     <a:xfrm>
                       <a:off x="0" y="0"/>
-                      <a:ext cx="5612130" cy="1999615"/>
+                      <a:ext cx="4681986" cy="4147462"/>
                     </a:xfrm>
                     <a:prstGeom prst="rect">
                       <a:avLst/>
@@ -4962,125 +3812,199 @@
     </w:p>
     <w:p>
       <w:pPr>
-        <w:spacing w:after="120" w:line="360" w:lineRule="auto"/>
-        <w:jc w:val="both"/>
-        <w:rPr>
-          <w:lang w:val="en-US"/>
-        </w:rPr>
-      </w:pPr>
-    </w:p>
-    <w:p>
-      <w:pPr>
-        <w:spacing w:after="120" w:line="360" w:lineRule="auto"/>
-        <w:jc w:val="both"/>
-        <w:rPr>
-          <w:lang w:val="en-US"/>
-        </w:rPr>
-      </w:pPr>
-    </w:p>
-    <w:p>
-      <w:pPr>
-        <w:spacing w:after="120" w:line="360" w:lineRule="auto"/>
-        <w:jc w:val="both"/>
-        <w:rPr>
-          <w:lang w:val="en-US"/>
-        </w:rPr>
-      </w:pPr>
-    </w:p>
-    <w:p>
-      <w:pPr>
-        <w:spacing w:after="120" w:line="360" w:lineRule="auto"/>
-        <w:jc w:val="both"/>
-        <w:rPr>
-          <w:lang w:val="en-US"/>
-        </w:rPr>
-      </w:pPr>
-      <w:r>
-        <w:rPr>
-          <w:b/>
-          <w:bCs/>
-          <w:lang w:val="en-US"/>
-        </w:rPr>
-        <w:t>S5 Figure.</w:t>
-      </w:r>
-      <w:r>
-        <w:rPr>
-          <w:lang w:val="en-US"/>
-        </w:rPr>
-        <w:t xml:space="preserve"> Inter-cluster distance heatmap</w:t>
-      </w:r>
-      <w:r>
-        <w:rPr>
-          <w:lang w:val="en-US"/>
-        </w:rPr>
-        <w:t>.</w:t>
-      </w:r>
-    </w:p>
-    <w:p>
-      <w:pPr>
-        <w:spacing w:after="120" w:line="360" w:lineRule="auto"/>
-        <w:jc w:val="both"/>
-        <w:rPr>
-          <w:b/>
-          <w:bCs/>
-          <w:caps/>
-          <w:sz w:val="28"/>
-          <w:szCs w:val="28"/>
-          <w:lang w:val="en-US"/>
-        </w:rPr>
-      </w:pPr>
-      <w:r>
-        <w:rPr>
-          <w:b/>
-          <w:bCs/>
-          <w:caps/>
-          <w:noProof/>
-          <w:sz w:val="28"/>
-          <w:szCs w:val="28"/>
+        <w:pStyle w:val="Ttulo2"/>
+        <w:spacing w:before="200" w:after="80"/>
+        <w:rPr>
+          <w:lang w:val="en-US"/>
+        </w:rPr>
+      </w:pPr>
+      <w:r>
+        <w:rPr>
+          <w:b/>
+          <w:bCs/>
+          <w:i/>
+          <w:iCs/>
+          <w:sz w:val="24"/>
+          <w:szCs w:val="24"/>
           <w:lang w:val="en-US"/>
         </w:rPr>
         <w:lastRenderedPageBreak/>
-        <w:drawing>
-          <wp:inline distT="0" distB="0" distL="0" distR="0" wp14:anchorId="01E1CE0E" wp14:editId="0D94A25B">
-            <wp:extent cx="5612130" cy="4971415"/>
-            <wp:effectExtent l="0" t="0" r="7620" b="635"/>
-            <wp:docPr id="8" name="Imagem 8"/>
-            <wp:cNvGraphicFramePr>
-              <a:graphicFrameLocks xmlns:a="http://schemas.openxmlformats.org/drawingml/2006/main" noChangeAspect="1"/>
-            </wp:cNvGraphicFramePr>
-            <a:graphic xmlns:a="http://schemas.openxmlformats.org/drawingml/2006/main">
-              <a:graphicData uri="http://schemas.openxmlformats.org/drawingml/2006/picture">
-                <pic:pic xmlns:pic="http://schemas.openxmlformats.org/drawingml/2006/picture">
-                  <pic:nvPicPr>
-                    <pic:cNvPr id="8" name="Imagem 8"/>
-                    <pic:cNvPicPr/>
-                  </pic:nvPicPr>
-                  <pic:blipFill>
-                    <a:blip r:embed="rId16" cstate="print">
-                      <a:extLst>
-                        <a:ext uri="{28A0092B-C50C-407E-A947-70E740481C1C}">
-                          <a14:useLocalDpi xmlns:a14="http://schemas.microsoft.com/office/drawing/2010/main" val="0"/>
-                        </a:ext>
-                      </a:extLst>
-                    </a:blip>
-                    <a:stretch>
-                      <a:fillRect/>
-                    </a:stretch>
-                  </pic:blipFill>
-                  <pic:spPr>
-                    <a:xfrm>
-                      <a:off x="0" y="0"/>
-                      <a:ext cx="5612130" cy="4971415"/>
-                    </a:xfrm>
-                    <a:prstGeom prst="rect">
-                      <a:avLst/>
-                    </a:prstGeom>
-                  </pic:spPr>
-                </pic:pic>
-              </a:graphicData>
-            </a:graphic>
-          </wp:inline>
-        </w:drawing>
+        <w:t>Artificial Intelligence Use Statement</w:t>
+      </w:r>
+    </w:p>
+    <w:p>
+      <w:pPr>
+        <w:spacing w:after="120" w:line="360" w:lineRule="auto"/>
+        <w:jc w:val="both"/>
+        <w:rPr>
+          <w:lang w:val="en-US"/>
+        </w:rPr>
+      </w:pPr>
+      <w:r>
+        <w:rPr>
+          <w:lang w:val="en-US"/>
+        </w:rPr>
+        <w:t xml:space="preserve">Artificial Intelligence </w:t>
+      </w:r>
+      <w:r>
+        <w:rPr>
+          <w:lang w:val="en-US"/>
+        </w:rPr>
+        <w:t>writing assistance tools were used in the preparation of this manuscript for grammar checking and language editing. All scientific content, analysis, interpretations, and conclusions are the sole responsibility of the author. No AI tool was used to generate, fabricate, or alter data or results.</w:t>
+      </w:r>
+    </w:p>
+    <w:p>
+      <w:pPr>
+        <w:pStyle w:val="Ttulo2"/>
+        <w:spacing w:before="240" w:after="120"/>
+        <w:rPr>
+          <w:b/>
+          <w:bCs/>
+          <w:i/>
+          <w:iCs/>
+          <w:sz w:val="24"/>
+          <w:szCs w:val="24"/>
+          <w:lang w:val="en-US"/>
+        </w:rPr>
+      </w:pPr>
+      <w:r>
+        <w:rPr>
+          <w:b/>
+          <w:bCs/>
+          <w:i/>
+          <w:iCs/>
+          <w:sz w:val="24"/>
+          <w:szCs w:val="24"/>
+          <w:lang w:val="en-US"/>
+        </w:rPr>
+        <w:t xml:space="preserve">Data </w:t>
+      </w:r>
+      <w:r>
+        <w:rPr>
+          <w:b/>
+          <w:bCs/>
+          <w:i/>
+          <w:iCs/>
+          <w:sz w:val="24"/>
+          <w:szCs w:val="24"/>
+          <w:lang w:val="en-US"/>
+        </w:rPr>
+        <w:t>Availability Statement</w:t>
+      </w:r>
+    </w:p>
+    <w:p>
+      <w:pPr>
+        <w:spacing w:after="120" w:line="360" w:lineRule="auto"/>
+        <w:jc w:val="both"/>
+        <w:rPr>
+          <w:u w:val="single"/>
+          <w:lang w:val="en-US"/>
+        </w:rPr>
+      </w:pPr>
+      <w:r>
+        <w:rPr>
+          <w:lang w:val="en-US"/>
+        </w:rPr>
+        <w:t xml:space="preserve">All analysis code is publicly available at </w:t>
+      </w:r>
+      <w:hyperlink r:id="rId16" w:history="1">
+        <w:r>
+          <w:rPr>
+            <w:rStyle w:val="Hyperlink"/>
+            <w:lang w:val="en-US"/>
+          </w:rPr>
+          <w:t>github.com/g4bfernandoo/regional-health-disparities-brazil</w:t>
+        </w:r>
+      </w:hyperlink>
+      <w:r>
+        <w:rPr>
+          <w:lang w:val="en-US"/>
+        </w:rPr>
+        <w:t>. Raw data are publicly available from DATASUS and IBGE under Brazil's Lei de Acesso à Informação (Law 12,527/2011).</w:t>
+      </w:r>
+    </w:p>
+    <w:p>
+      <w:pPr>
+        <w:pStyle w:val="Ttulo2"/>
+        <w:spacing w:before="240" w:after="120"/>
+        <w:rPr>
+          <w:b/>
+          <w:bCs/>
+          <w:i/>
+          <w:iCs/>
+          <w:sz w:val="24"/>
+          <w:szCs w:val="24"/>
+          <w:lang w:val="en-US"/>
+        </w:rPr>
+      </w:pPr>
+      <w:r>
+        <w:rPr>
+          <w:b/>
+          <w:bCs/>
+          <w:i/>
+          <w:iCs/>
+          <w:sz w:val="24"/>
+          <w:szCs w:val="24"/>
+          <w:lang w:val="en-US"/>
+        </w:rPr>
+        <w:t>Funding</w:t>
+      </w:r>
+    </w:p>
+    <w:p>
+      <w:pPr>
+        <w:spacing w:after="120" w:line="360" w:lineRule="auto"/>
+        <w:jc w:val="both"/>
+        <w:rPr>
+          <w:lang w:val="en-US"/>
+        </w:rPr>
+      </w:pPr>
+      <w:r>
+        <w:rPr>
+          <w:lang w:val="en-US"/>
+        </w:rPr>
+        <w:t>This research received no external funding.</w:t>
+      </w:r>
+    </w:p>
+    <w:p>
+      <w:pPr>
+        <w:pStyle w:val="Ttulo2"/>
+        <w:spacing w:before="240" w:after="120"/>
+        <w:rPr>
+          <w:b/>
+          <w:bCs/>
+          <w:i/>
+          <w:iCs/>
+          <w:sz w:val="24"/>
+          <w:szCs w:val="24"/>
+          <w:lang w:val="en-US"/>
+        </w:rPr>
+      </w:pPr>
+      <w:r>
+        <w:rPr>
+          <w:b/>
+          <w:bCs/>
+          <w:i/>
+          <w:iCs/>
+          <w:sz w:val="24"/>
+          <w:szCs w:val="24"/>
+          <w:lang w:val="en-US"/>
+        </w:rPr>
+        <w:t>Conflicts of Interest</w:t>
+      </w:r>
+    </w:p>
+    <w:p>
+      <w:pPr>
+        <w:spacing w:after="120" w:line="360" w:lineRule="auto"/>
+        <w:jc w:val="both"/>
+        <w:rPr>
+          <w:lang w:val="en-US"/>
+        </w:rPr>
+      </w:pPr>
+      <w:r>
+        <w:rPr>
+          <w:lang w:val="en-US"/>
+        </w:rPr>
+        <w:t>The author declares no conflicts of interest.</w:t>
       </w:r>
     </w:p>
     <w:p>
@@ -5169,21 +4093,7 @@
         <w:rPr>
           <w:lang w:val="en-US"/>
         </w:rPr>
-        <w:t xml:space="preserve">[2] Ribeiro ALP, Duncan BB, Brant LCC, </w:t>
-      </w:r>
-      <w:proofErr w:type="spellStart"/>
-      <w:r>
-        <w:rPr>
-          <w:lang w:val="en-US"/>
-        </w:rPr>
-        <w:t>Lotufo</w:t>
-      </w:r>
-      <w:proofErr w:type="spellEnd"/>
-      <w:r>
-        <w:rPr>
-          <w:lang w:val="en-US"/>
-        </w:rPr>
-        <w:t xml:space="preserve"> PA, Mill JG, Barreto SM. </w:t>
+        <w:t xml:space="preserve">[2] Ribeiro ALP, Duncan BB, Brant LCC, Lotufo PA, Mill JG, Barreto SM. </w:t>
       </w:r>
       <w:r>
         <w:rPr>
@@ -5191,13 +4101,8 @@
         </w:rPr>
         <w:t xml:space="preserve">Cardiovascular Health in Brazil: Trends and Perspectives. </w:t>
       </w:r>
-      <w:proofErr w:type="spellStart"/>
-      <w:r>
-        <w:t>Circulation</w:t>
-      </w:r>
-      <w:proofErr w:type="spellEnd"/>
-      <w:r>
-        <w:t>. 2016;133(4):422–433.</w:t>
+      <w:r>
+        <w:t>Circulation. 2016;133(4):422–433.</w:t>
       </w:r>
       <w:r>
         <w:t xml:space="preserve"> </w:t>
@@ -5253,7 +4158,6 @@
         <w:rPr>
           <w:lang w:val="en-US"/>
         </w:rPr>
-        <w:lastRenderedPageBreak/>
         <w:t xml:space="preserve">[4] Nascimento BR, Brant LCC, Marino BCA, et al. </w:t>
       </w:r>
       <w:r>
@@ -5262,29 +4166,8 @@
         </w:rPr>
         <w:t xml:space="preserve">Cardiovascular Disease Epidemiology in Portuguese-Speaking Countries: data from the Global Burden of Disease, 1990 to 2016. </w:t>
       </w:r>
-      <w:proofErr w:type="spellStart"/>
-      <w:r>
-        <w:t>Arq</w:t>
-      </w:r>
-      <w:proofErr w:type="spellEnd"/>
-      <w:r>
-        <w:t xml:space="preserve"> </w:t>
-      </w:r>
-      <w:proofErr w:type="spellStart"/>
-      <w:r>
-        <w:t>Bras</w:t>
-      </w:r>
-      <w:proofErr w:type="spellEnd"/>
-      <w:r>
-        <w:t xml:space="preserve"> </w:t>
-      </w:r>
-      <w:proofErr w:type="spellStart"/>
-      <w:r>
-        <w:t>Cardiol</w:t>
-      </w:r>
-      <w:proofErr w:type="spellEnd"/>
-      <w:r>
-        <w:t>. 2018;110(6):500–511.</w:t>
+      <w:r>
+        <w:t>Arq Bras Cardiol. 2018;110(6):500–511.</w:t>
       </w:r>
       <w:r>
         <w:t xml:space="preserve"> </w:t>
@@ -5310,23 +4193,11 @@
         </w:rPr>
       </w:pPr>
       <w:r>
+        <w:lastRenderedPageBreak/>
         <w:t xml:space="preserve">[5] Ministério da Saúde (Brasil). DATASUS: Sistema de Informações sobre Mortalidade e Sistema de Informações Hospitalares. Brasília: Ministério da Saúde; 2024. </w:t>
       </w:r>
-      <w:proofErr w:type="spellStart"/>
-      <w:r>
-        <w:t>Available</w:t>
-      </w:r>
-      <w:proofErr w:type="spellEnd"/>
-      <w:r>
-        <w:t xml:space="preserve"> </w:t>
-      </w:r>
-      <w:proofErr w:type="spellStart"/>
-      <w:r>
-        <w:t>from</w:t>
-      </w:r>
-      <w:proofErr w:type="spellEnd"/>
-      <w:r>
-        <w:t xml:space="preserve">: </w:t>
+      <w:r>
+        <w:t xml:space="preserve">Available from: </w:t>
       </w:r>
       <w:hyperlink r:id="rId21" w:history="1">
         <w:r>
@@ -5349,43 +4220,13 @@
         </w:rPr>
       </w:pPr>
       <w:r>
-        <w:t xml:space="preserve">[6] Garcia S, </w:t>
-      </w:r>
-      <w:proofErr w:type="spellStart"/>
-      <w:r>
-        <w:t>Albaghdadi</w:t>
-      </w:r>
-      <w:proofErr w:type="spellEnd"/>
-      <w:r>
-        <w:t xml:space="preserve"> MS, </w:t>
-      </w:r>
-      <w:proofErr w:type="spellStart"/>
-      <w:r>
-        <w:t>Meraj</w:t>
-      </w:r>
-      <w:proofErr w:type="spellEnd"/>
-      <w:r>
-        <w:t xml:space="preserve"> PM, et al. </w:t>
-      </w:r>
-      <w:r>
-        <w:rPr>
-          <w:lang w:val="en-US"/>
-        </w:rPr>
-        <w:t xml:space="preserve">Reduction in ST-Segment Elevation Cardiac Catheterization Laboratory Activations in the United States During COVID-19 Pandemic. J Am Coll </w:t>
-      </w:r>
-      <w:proofErr w:type="spellStart"/>
-      <w:r>
-        <w:rPr>
-          <w:lang w:val="en-US"/>
-        </w:rPr>
-        <w:t>Cardiol</w:t>
-      </w:r>
-      <w:proofErr w:type="spellEnd"/>
-      <w:r>
-        <w:rPr>
-          <w:lang w:val="en-US"/>
-        </w:rPr>
-        <w:t>. 2020;75(22):2871–2872.</w:t>
+        <w:t xml:space="preserve">[6] Garcia S, Albaghdadi MS, Meraj PM, et al. </w:t>
+      </w:r>
+      <w:r>
+        <w:rPr>
+          <w:lang w:val="en-US"/>
+        </w:rPr>
+        <w:t>Reduction in ST-Segment Elevation Cardiac Catheterization Laboratory Activations in the United States During COVID-19 Pandemic. J Am Coll Cardiol. 2020;75(22):2871–2872.</w:t>
       </w:r>
       <w:r>
         <w:rPr>

</xml_diff>